<commit_message>
Agregamos a google analytics
</commit_message>
<xml_diff>
--- a/www/Instrucciones_nutrición_cultivos_version2.docx
+++ b/www/Instrucciones_nutrición_cultivos_version2.docx
@@ -168,28 +168,6 @@
           <w:bCs/>
         </w:rPr>
         <w:br w:type="page"/>
-      </w:r>
-    </w:p>
-    <w:p>
-      <w:pPr>
-        <w:rPr>
-          <w:rFonts w:ascii="Calibri" w:hAnsi="Calibri" w:cs="Calibri"/>
-          <w:b/>
-          <w:bCs/>
-          <w:sz w:val="32"/>
-          <w:szCs w:val="32"/>
-        </w:rPr>
-      </w:pPr>
-      <w:r>
-        <w:rPr>
-          <w:rFonts w:ascii="Calibri" w:hAnsi="Calibri" w:cs="Calibri"/>
-          <w:b/>
-          <w:bCs/>
-          <w:sz w:val="32"/>
-          <w:szCs w:val="32"/>
-        </w:rPr>
-        <w:lastRenderedPageBreak/>
-        <w:t>Índice</w:t>
       </w:r>
     </w:p>
     <w:p>
@@ -220,6 +198,17 @@
           <w:sz w:val="32"/>
           <w:szCs w:val="32"/>
         </w:rPr>
+        <w:lastRenderedPageBreak/>
+        <w:t>Índice</w:t>
+      </w:r>
+      <w:r>
+        <w:rPr>
+          <w:rFonts w:ascii="Calibri" w:hAnsi="Calibri" w:cs="Calibri"/>
+          <w:b/>
+          <w:bCs/>
+          <w:sz w:val="32"/>
+          <w:szCs w:val="32"/>
+        </w:rPr>
         <w:fldChar w:fldCharType="begin"/>
       </w:r>
       <w:r>
@@ -659,6 +648,7 @@
         </w:tabs>
         <w:spacing w:line="360" w:lineRule="auto"/>
         <w:rPr>
+          <w:b/>
           <w:bCs/>
           <w:noProof/>
           <w:sz w:val="24"/>
@@ -715,7 +705,7 @@
           <w:sz w:val="24"/>
           <w:szCs w:val="24"/>
         </w:rPr>
-        <w:t>Azufre</w:t>
+        <w:t>Potasio</w:t>
       </w:r>
     </w:p>
     <w:p>
@@ -768,7 +758,6 @@
         </w:tabs>
         <w:spacing w:line="360" w:lineRule="auto"/>
         <w:rPr>
-          <w:b/>
           <w:bCs/>
           <w:noProof/>
           <w:sz w:val="24"/>
@@ -825,7 +814,7 @@
           <w:sz w:val="24"/>
           <w:szCs w:val="24"/>
         </w:rPr>
-        <w:t>Zinc</w:t>
+        <w:t>Azufre</w:t>
       </w:r>
     </w:p>
     <w:p>
@@ -867,7 +856,17 @@
           <w:sz w:val="24"/>
           <w:szCs w:val="24"/>
         </w:rPr>
-        <w:t>12</w:t>
+        <w:t>1</w:t>
+      </w:r>
+      <w:r>
+        <w:rPr>
+          <w:b/>
+          <w:bCs/>
+          <w:noProof/>
+          <w:sz w:val="24"/>
+          <w:szCs w:val="24"/>
+        </w:rPr>
+        <w:t>2</w:t>
       </w:r>
     </w:p>
     <w:p>
@@ -890,6 +889,7 @@
           <w:noProof/>
           <w:sz w:val="24"/>
           <w:szCs w:val="24"/>
+          <w:lang w:val="es-ES"/>
         </w:rPr>
         <w:t>Múltiples lotes</w:t>
       </w:r>
@@ -909,7 +909,17 @@
           <w:sz w:val="24"/>
           <w:szCs w:val="24"/>
         </w:rPr>
-        <w:t>12</w:t>
+        <w:t>1</w:t>
+      </w:r>
+      <w:r>
+        <w:rPr>
+          <w:b/>
+          <w:bCs/>
+          <w:noProof/>
+          <w:sz w:val="24"/>
+          <w:szCs w:val="24"/>
+        </w:rPr>
+        <w:t>3</w:t>
       </w:r>
     </w:p>
     <w:p>
@@ -934,7 +944,7 @@
           <w:sz w:val="24"/>
           <w:szCs w:val="24"/>
         </w:rPr>
-        <w:t>Boro</w:t>
+        <w:t>Zinc</w:t>
       </w:r>
     </w:p>
     <w:p>
@@ -976,7 +986,17 @@
           <w:sz w:val="24"/>
           <w:szCs w:val="24"/>
         </w:rPr>
-        <w:t>13</w:t>
+        <w:t>1</w:t>
+      </w:r>
+      <w:r>
+        <w:rPr>
+          <w:b/>
+          <w:bCs/>
+          <w:noProof/>
+          <w:sz w:val="24"/>
+          <w:szCs w:val="24"/>
+        </w:rPr>
+        <w:t>4</w:t>
       </w:r>
     </w:p>
     <w:p>
@@ -1018,7 +1038,17 @@
           <w:sz w:val="24"/>
           <w:szCs w:val="24"/>
         </w:rPr>
-        <w:t>13</w:t>
+        <w:t>1</w:t>
+      </w:r>
+      <w:r>
+        <w:rPr>
+          <w:b/>
+          <w:bCs/>
+          <w:noProof/>
+          <w:sz w:val="24"/>
+          <w:szCs w:val="24"/>
+        </w:rPr>
+        <w:t>4</w:t>
       </w:r>
     </w:p>
     <w:p>
@@ -1029,7 +1059,6 @@
         </w:tabs>
         <w:spacing w:line="360" w:lineRule="auto"/>
         <w:rPr>
-          <w:bCs/>
           <w:noProof/>
           <w:sz w:val="24"/>
           <w:szCs w:val="24"/>
@@ -1044,25 +1073,111 @@
           <w:sz w:val="24"/>
           <w:szCs w:val="24"/>
         </w:rPr>
-        <w:t>Recomendaciones</w:t>
-      </w:r>
-      <w:r>
-        <w:rPr>
+        <w:t>Boro</w:t>
+      </w:r>
+    </w:p>
+    <w:p>
+      <w:pPr>
+        <w:pStyle w:val="ndice2"/>
+        <w:tabs>
+          <w:tab w:val="right" w:leader="dot" w:pos="8494"/>
+        </w:tabs>
+        <w:spacing w:line="360" w:lineRule="auto"/>
+        <w:rPr>
+          <w:bCs/>
           <w:noProof/>
           <w:sz w:val="24"/>
           <w:szCs w:val="24"/>
         </w:rPr>
-        <w:tab/>
-      </w:r>
-      <w:r>
-        <w:rPr>
-          <w:b/>
-          <w:bCs/>
+      </w:pPr>
+      <w:r>
+        <w:rPr>
           <w:noProof/>
           <w:sz w:val="24"/>
           <w:szCs w:val="24"/>
-        </w:rPr>
-        <w:t>14</w:t>
+          <w:lang w:val="es-ES"/>
+        </w:rPr>
+        <w:t>Lote único</w:t>
+      </w:r>
+      <w:r>
+        <w:rPr>
+          <w:noProof/>
+          <w:sz w:val="24"/>
+          <w:szCs w:val="24"/>
+        </w:rPr>
+        <w:tab/>
+      </w:r>
+      <w:r>
+        <w:rPr>
+          <w:b/>
+          <w:bCs/>
+          <w:noProof/>
+          <w:sz w:val="24"/>
+          <w:szCs w:val="24"/>
+        </w:rPr>
+        <w:t>1</w:t>
+      </w:r>
+      <w:r>
+        <w:rPr>
+          <w:b/>
+          <w:bCs/>
+          <w:noProof/>
+          <w:sz w:val="24"/>
+          <w:szCs w:val="24"/>
+        </w:rPr>
+        <w:t>5</w:t>
+      </w:r>
+    </w:p>
+    <w:p>
+      <w:pPr>
+        <w:pStyle w:val="ndice2"/>
+        <w:tabs>
+          <w:tab w:val="right" w:leader="dot" w:pos="8494"/>
+        </w:tabs>
+        <w:spacing w:line="360" w:lineRule="auto"/>
+        <w:rPr>
+          <w:b/>
+          <w:bCs/>
+          <w:noProof/>
+          <w:sz w:val="24"/>
+          <w:szCs w:val="24"/>
+        </w:rPr>
+      </w:pPr>
+      <w:r>
+        <w:rPr>
+          <w:noProof/>
+          <w:sz w:val="24"/>
+          <w:szCs w:val="24"/>
+        </w:rPr>
+        <w:t>Múltiples lotes</w:t>
+      </w:r>
+      <w:r>
+        <w:rPr>
+          <w:noProof/>
+          <w:sz w:val="24"/>
+          <w:szCs w:val="24"/>
+        </w:rPr>
+        <w:tab/>
+      </w:r>
+      <w:r>
+        <w:rPr>
+          <w:b/>
+          <w:bCs/>
+          <w:noProof/>
+          <w:sz w:val="24"/>
+          <w:szCs w:val="24"/>
+        </w:rPr>
+        <w:t>1</w:t>
+      </w:r>
+      <w:r>
+        <w:rPr>
+          <w:b/>
+          <w:bCs/>
+          <w:noProof/>
+          <w:sz w:val="24"/>
+          <w:szCs w:val="24"/>
+        </w:rPr>
+        <w:t>5</w:t>
       </w:r>
     </w:p>
     <w:p>
@@ -1073,6 +1188,60 @@
         </w:tabs>
         <w:spacing w:line="360" w:lineRule="auto"/>
         <w:rPr>
+          <w:bCs/>
+          <w:noProof/>
+          <w:sz w:val="24"/>
+          <w:szCs w:val="24"/>
+        </w:rPr>
+      </w:pPr>
+      <w:r>
+        <w:rPr>
+          <w:rFonts w:ascii="Calibri" w:hAnsi="Calibri" w:cs="Calibri"/>
+          <w:b/>
+          <w:bCs/>
+          <w:noProof/>
+          <w:sz w:val="24"/>
+          <w:szCs w:val="24"/>
+        </w:rPr>
+        <w:t>Recomendaciones</w:t>
+      </w:r>
+      <w:r>
+        <w:rPr>
+          <w:noProof/>
+          <w:sz w:val="24"/>
+          <w:szCs w:val="24"/>
+        </w:rPr>
+        <w:tab/>
+      </w:r>
+      <w:r>
+        <w:rPr>
+          <w:b/>
+          <w:bCs/>
+          <w:noProof/>
+          <w:sz w:val="24"/>
+          <w:szCs w:val="24"/>
+        </w:rPr>
+        <w:t>1</w:t>
+      </w:r>
+      <w:r>
+        <w:rPr>
+          <w:b/>
+          <w:bCs/>
+          <w:noProof/>
+          <w:sz w:val="24"/>
+          <w:szCs w:val="24"/>
+        </w:rPr>
+        <w:t>6</w:t>
+      </w:r>
+    </w:p>
+    <w:p>
+      <w:pPr>
+        <w:pStyle w:val="ndice1"/>
+        <w:tabs>
+          <w:tab w:val="right" w:leader="dot" w:pos="8494"/>
+        </w:tabs>
+        <w:spacing w:line="360" w:lineRule="auto"/>
+        <w:rPr>
           <w:b/>
           <w:bCs/>
           <w:noProof/>
@@ -1236,7 +1405,17 @@
           <w:sz w:val="24"/>
           <w:szCs w:val="24"/>
         </w:rPr>
-        <w:t>15</w:t>
+        <w:t>1</w:t>
+      </w:r>
+      <w:r>
+        <w:rPr>
+          <w:b/>
+          <w:bCs/>
+          <w:noProof/>
+          <w:sz w:val="24"/>
+          <w:szCs w:val="24"/>
+        </w:rPr>
+        <w:t>7</w:t>
       </w:r>
     </w:p>
     <w:p>
@@ -1291,7 +1470,7 @@
           <w:sz w:val="24"/>
           <w:szCs w:val="24"/>
         </w:rPr>
-        <w:t>6</w:t>
+        <w:t>8</w:t>
       </w:r>
       <w:r>
         <w:rPr>
@@ -1303,17 +1482,6 @@
         </w:rPr>
         <w:fldChar w:fldCharType="end"/>
       </w:r>
-    </w:p>
-    <w:p>
-      <w:pPr>
-        <w:rPr>
-          <w:rFonts w:ascii="Calibri" w:hAnsi="Calibri" w:cs="Calibri"/>
-          <w:b/>
-          <w:bCs/>
-          <w:sz w:val="32"/>
-          <w:szCs w:val="32"/>
-        </w:rPr>
-      </w:pPr>
       <w:r>
         <w:rPr>
           <w:rFonts w:ascii="Calibri" w:hAnsi="Calibri" w:cs="Calibri"/>
@@ -6450,7 +6618,23 @@
           <w:sz w:val="28"/>
           <w:szCs w:val="28"/>
         </w:rPr>
-        <w:t>Ingresar P-Bray a 0-20cm.</w:t>
+        <w:t xml:space="preserve">Ingresar P-Bray </w:t>
+      </w:r>
+      <w:r>
+        <w:rPr>
+          <w:rFonts w:ascii="Calibri" w:hAnsi="Calibri" w:cs="Calibri"/>
+          <w:sz w:val="28"/>
+          <w:szCs w:val="28"/>
+        </w:rPr>
+        <w:t xml:space="preserve">(ppm) </w:t>
+      </w:r>
+      <w:r>
+        <w:rPr>
+          <w:rFonts w:ascii="Calibri" w:hAnsi="Calibri" w:cs="Calibri"/>
+          <w:sz w:val="28"/>
+          <w:szCs w:val="28"/>
+        </w:rPr>
+        <w:t>a 0-20cm.</w:t>
       </w:r>
     </w:p>
     <w:p>
@@ -6640,6 +6824,92 @@
           <w:szCs w:val="28"/>
         </w:rPr>
         <w:t>.</w:t>
+      </w:r>
+    </w:p>
+    <w:p>
+      <w:pPr>
+        <w:pStyle w:val="Prrafodelista"/>
+        <w:numPr>
+          <w:ilvl w:val="2"/>
+          <w:numId w:val="4"/>
+        </w:numPr>
+        <w:rPr>
+          <w:rFonts w:ascii="Calibri" w:hAnsi="Calibri" w:cs="Calibri"/>
+          <w:sz w:val="28"/>
+          <w:szCs w:val="28"/>
+        </w:rPr>
+      </w:pPr>
+      <w:r>
+        <w:rPr>
+          <w:rFonts w:ascii="Calibri" w:hAnsi="Calibri" w:cs="Calibri"/>
+          <w:sz w:val="28"/>
+          <w:szCs w:val="28"/>
+        </w:rPr>
+        <w:t xml:space="preserve">La dosis de construcción no es necesario aplicarla en un solo </w:t>
+      </w:r>
+      <w:proofErr w:type="gramStart"/>
+      <w:r>
+        <w:rPr>
+          <w:rFonts w:ascii="Calibri" w:hAnsi="Calibri" w:cs="Calibri"/>
+          <w:sz w:val="28"/>
+          <w:szCs w:val="28"/>
+        </w:rPr>
+        <w:t>año</w:t>
+      </w:r>
+      <w:proofErr w:type="gramEnd"/>
+      <w:r>
+        <w:rPr>
+          <w:rFonts w:ascii="Calibri" w:hAnsi="Calibri" w:cs="Calibri"/>
+          <w:sz w:val="28"/>
+          <w:szCs w:val="28"/>
+        </w:rPr>
+        <w:t xml:space="preserve"> sino que dependerá de diferentes factores (relación </w:t>
+      </w:r>
+      <w:proofErr w:type="spellStart"/>
+      <w:proofErr w:type="gramStart"/>
+      <w:r>
+        <w:rPr>
+          <w:rFonts w:ascii="Calibri" w:hAnsi="Calibri" w:cs="Calibri"/>
+          <w:sz w:val="28"/>
+          <w:szCs w:val="28"/>
+        </w:rPr>
+        <w:t>insumo:producto</w:t>
+      </w:r>
+      <w:proofErr w:type="spellEnd"/>
+      <w:proofErr w:type="gramEnd"/>
+      <w:r>
+        <w:rPr>
+          <w:rFonts w:ascii="Calibri" w:hAnsi="Calibri" w:cs="Calibri"/>
+          <w:sz w:val="28"/>
+          <w:szCs w:val="28"/>
+        </w:rPr>
+        <w:t xml:space="preserve">, logística, cultivo, </w:t>
+      </w:r>
+      <w:proofErr w:type="spellStart"/>
+      <w:r>
+        <w:rPr>
+          <w:rFonts w:ascii="Calibri" w:hAnsi="Calibri" w:cs="Calibri"/>
+          <w:sz w:val="28"/>
+          <w:szCs w:val="28"/>
+        </w:rPr>
+        <w:t>etc</w:t>
+      </w:r>
+      <w:proofErr w:type="spellEnd"/>
+      <w:r>
+        <w:rPr>
+          <w:rFonts w:ascii="Calibri" w:hAnsi="Calibri" w:cs="Calibri"/>
+          <w:sz w:val="28"/>
+          <w:szCs w:val="28"/>
+        </w:rPr>
+        <w:t>…</w:t>
+      </w:r>
+      <w:r>
+        <w:rPr>
+          <w:rFonts w:ascii="Calibri" w:hAnsi="Calibri" w:cs="Calibri"/>
+          <w:sz w:val="28"/>
+          <w:szCs w:val="28"/>
+        </w:rPr>
+        <w:t>)</w:t>
       </w:r>
     </w:p>
     <w:p>
@@ -8842,6 +9112,2889 @@
       <w:pPr>
         <w:rPr>
           <w:rFonts w:ascii="Calibri" w:hAnsi="Calibri" w:cs="Calibri"/>
+          <w:sz w:val="28"/>
+          <w:szCs w:val="28"/>
+        </w:rPr>
+      </w:pPr>
+      <w:r>
+        <w:rPr>
+          <w:rFonts w:ascii="Calibri" w:hAnsi="Calibri" w:cs="Calibri"/>
+          <w:sz w:val="28"/>
+          <w:szCs w:val="28"/>
+        </w:rPr>
+        <w:br w:type="page"/>
+      </w:r>
+    </w:p>
+    <w:p>
+      <w:pPr>
+        <w:rPr>
+          <w:rFonts w:ascii="Calibri" w:hAnsi="Calibri" w:cs="Calibri"/>
+          <w:b/>
+          <w:bCs/>
+          <w:sz w:val="28"/>
+          <w:szCs w:val="28"/>
+        </w:rPr>
+      </w:pPr>
+      <w:r>
+        <w:rPr>
+          <w:rFonts w:ascii="Calibri" w:hAnsi="Calibri" w:cs="Calibri"/>
+          <w:b/>
+          <w:bCs/>
+          <w:sz w:val="32"/>
+          <w:szCs w:val="32"/>
+        </w:rPr>
+        <w:lastRenderedPageBreak/>
+        <w:t>Potasio</w:t>
+      </w:r>
+      <w:r>
+        <w:rPr>
+          <w:rFonts w:ascii="Calibri" w:hAnsi="Calibri" w:cs="Calibri"/>
+          <w:b/>
+          <w:bCs/>
+          <w:sz w:val="28"/>
+          <w:szCs w:val="28"/>
+        </w:rPr>
+        <w:fldChar w:fldCharType="begin"/>
+      </w:r>
+      <w:r>
+        <w:instrText xml:space="preserve"> XE "</w:instrText>
+      </w:r>
+      <w:r>
+        <w:rPr>
+          <w:rFonts w:ascii="Calibri" w:hAnsi="Calibri" w:cs="Calibri"/>
+          <w:b/>
+          <w:bCs/>
+          <w:sz w:val="28"/>
+          <w:szCs w:val="28"/>
+        </w:rPr>
+        <w:instrText>Fósforo:</w:instrText>
+      </w:r>
+      <w:r>
+        <w:rPr>
+          <w:lang w:val="es-ES"/>
+        </w:rPr>
+        <w:instrText>Múltiples lotes; Lote único</w:instrText>
+      </w:r>
+      <w:r>
+        <w:instrText xml:space="preserve">" \b </w:instrText>
+      </w:r>
+      <w:r>
+        <w:rPr>
+          <w:rFonts w:ascii="Calibri" w:hAnsi="Calibri" w:cs="Calibri"/>
+          <w:b/>
+          <w:bCs/>
+          <w:sz w:val="28"/>
+          <w:szCs w:val="28"/>
+        </w:rPr>
+        <w:fldChar w:fldCharType="end"/>
+      </w:r>
+      <w:r>
+        <w:rPr>
+          <w:rFonts w:ascii="Calibri" w:hAnsi="Calibri" w:cs="Calibri"/>
+          <w:b/>
+          <w:bCs/>
+          <w:sz w:val="28"/>
+          <w:szCs w:val="28"/>
+        </w:rPr>
+        <w:fldChar w:fldCharType="begin"/>
+      </w:r>
+      <w:r>
+        <w:instrText xml:space="preserve"> XE "</w:instrText>
+      </w:r>
+      <w:r>
+        <w:rPr>
+          <w:rFonts w:ascii="Calibri" w:hAnsi="Calibri" w:cs="Calibri"/>
+          <w:b/>
+          <w:bCs/>
+          <w:sz w:val="28"/>
+          <w:szCs w:val="28"/>
+        </w:rPr>
+        <w:instrText>Fósforo:</w:instrText>
+      </w:r>
+      <w:r>
+        <w:rPr>
+          <w:lang w:val="es-ES"/>
+        </w:rPr>
+        <w:instrText>Lote único</w:instrText>
+      </w:r>
+      <w:r>
+        <w:instrText xml:space="preserve">" \b </w:instrText>
+      </w:r>
+      <w:r>
+        <w:rPr>
+          <w:rFonts w:ascii="Calibri" w:hAnsi="Calibri" w:cs="Calibri"/>
+          <w:b/>
+          <w:bCs/>
+          <w:sz w:val="28"/>
+          <w:szCs w:val="28"/>
+        </w:rPr>
+        <w:fldChar w:fldCharType="end"/>
+      </w:r>
+    </w:p>
+    <w:p>
+      <w:pPr>
+        <w:rPr>
+          <w:rFonts w:ascii="Calibri" w:hAnsi="Calibri" w:cs="Calibri"/>
+          <w:sz w:val="28"/>
+          <w:szCs w:val="28"/>
+        </w:rPr>
+      </w:pPr>
+      <w:r>
+        <w:rPr>
+          <w:rFonts w:ascii="Calibri" w:hAnsi="Calibri" w:cs="Calibri"/>
+          <w:b/>
+          <w:bCs/>
+          <w:sz w:val="28"/>
+          <w:szCs w:val="28"/>
+        </w:rPr>
+        <w:t>Opciones disponibles</w:t>
+      </w:r>
+      <w:r>
+        <w:rPr>
+          <w:rFonts w:ascii="Calibri" w:hAnsi="Calibri" w:cs="Calibri"/>
+          <w:sz w:val="28"/>
+          <w:szCs w:val="28"/>
+        </w:rPr>
+        <w:t>:</w:t>
+      </w:r>
+    </w:p>
+    <w:p>
+      <w:pPr>
+        <w:numPr>
+          <w:ilvl w:val="0"/>
+          <w:numId w:val="5"/>
+        </w:numPr>
+        <w:rPr>
+          <w:rFonts w:ascii="Calibri" w:hAnsi="Calibri" w:cs="Calibri"/>
+          <w:sz w:val="28"/>
+          <w:szCs w:val="28"/>
+        </w:rPr>
+      </w:pPr>
+      <w:r>
+        <w:rPr>
+          <w:rFonts w:ascii="Calibri" w:hAnsi="Calibri" w:cs="Calibri"/>
+          <w:b/>
+          <w:bCs/>
+          <w:sz w:val="28"/>
+          <w:szCs w:val="28"/>
+        </w:rPr>
+        <w:t>Lote único</w:t>
+      </w:r>
+      <w:r>
+        <w:rPr>
+          <w:rFonts w:ascii="Calibri" w:hAnsi="Calibri" w:cs="Calibri"/>
+          <w:sz w:val="28"/>
+          <w:szCs w:val="28"/>
+        </w:rPr>
+        <w:t>:</w:t>
+      </w:r>
+    </w:p>
+    <w:p>
+      <w:pPr>
+        <w:numPr>
+          <w:ilvl w:val="1"/>
+          <w:numId w:val="5"/>
+        </w:numPr>
+        <w:rPr>
+          <w:rFonts w:ascii="Calibri" w:hAnsi="Calibri" w:cs="Calibri"/>
+          <w:sz w:val="28"/>
+          <w:szCs w:val="28"/>
+        </w:rPr>
+      </w:pPr>
+      <w:r>
+        <w:rPr>
+          <w:rFonts w:ascii="Calibri" w:hAnsi="Calibri" w:cs="Calibri"/>
+          <w:sz w:val="28"/>
+          <w:szCs w:val="28"/>
+        </w:rPr>
+        <w:t>Seleccionar el cultivo (si selecciona doble cultivo, deberá ingresar información para ambos).</w:t>
+      </w:r>
+    </w:p>
+    <w:p>
+      <w:pPr>
+        <w:numPr>
+          <w:ilvl w:val="1"/>
+          <w:numId w:val="5"/>
+        </w:numPr>
+        <w:rPr>
+          <w:rFonts w:ascii="Calibri" w:hAnsi="Calibri" w:cs="Calibri"/>
+          <w:sz w:val="28"/>
+          <w:szCs w:val="28"/>
+        </w:rPr>
+      </w:pPr>
+      <w:r>
+        <w:rPr>
+          <w:rFonts w:ascii="Calibri" w:hAnsi="Calibri" w:cs="Calibri"/>
+          <w:b/>
+          <w:bCs/>
+          <w:sz w:val="28"/>
+          <w:szCs w:val="28"/>
+        </w:rPr>
+        <w:t>Cálculo de dosis de suficiencia</w:t>
+      </w:r>
+      <w:r>
+        <w:rPr>
+          <w:rFonts w:ascii="Calibri" w:hAnsi="Calibri" w:cs="Calibri"/>
+          <w:sz w:val="28"/>
+          <w:szCs w:val="28"/>
+        </w:rPr>
+        <w:t>:</w:t>
+      </w:r>
+    </w:p>
+    <w:p>
+      <w:pPr>
+        <w:numPr>
+          <w:ilvl w:val="2"/>
+          <w:numId w:val="5"/>
+        </w:numPr>
+        <w:rPr>
+          <w:rFonts w:ascii="Calibri" w:hAnsi="Calibri" w:cs="Calibri"/>
+          <w:sz w:val="28"/>
+          <w:szCs w:val="28"/>
+        </w:rPr>
+      </w:pPr>
+      <w:r>
+        <w:rPr>
+          <w:rFonts w:ascii="Calibri" w:hAnsi="Calibri" w:cs="Calibri"/>
+          <w:sz w:val="28"/>
+          <w:szCs w:val="28"/>
+        </w:rPr>
+        <w:t xml:space="preserve">Ingresar </w:t>
+      </w:r>
+      <w:r>
+        <w:rPr>
+          <w:rFonts w:ascii="Calibri" w:hAnsi="Calibri" w:cs="Calibri"/>
+          <w:sz w:val="28"/>
+          <w:szCs w:val="28"/>
+        </w:rPr>
+        <w:t>K-intercambiable (ppm)</w:t>
+      </w:r>
+      <w:r>
+        <w:rPr>
+          <w:rFonts w:ascii="Calibri" w:hAnsi="Calibri" w:cs="Calibri"/>
+          <w:sz w:val="28"/>
+          <w:szCs w:val="28"/>
+        </w:rPr>
+        <w:t xml:space="preserve"> a 0-20cm.</w:t>
+      </w:r>
+    </w:p>
+    <w:p>
+      <w:pPr>
+        <w:ind w:left="2160"/>
+        <w:rPr>
+          <w:rFonts w:ascii="Calibri" w:hAnsi="Calibri" w:cs="Calibri"/>
+          <w:sz w:val="28"/>
+          <w:szCs w:val="28"/>
+        </w:rPr>
+      </w:pPr>
+    </w:p>
+    <w:p>
+      <w:pPr>
+        <w:numPr>
+          <w:ilvl w:val="1"/>
+          <w:numId w:val="5"/>
+        </w:numPr>
+        <w:rPr>
+          <w:rFonts w:ascii="Calibri" w:hAnsi="Calibri" w:cs="Calibri"/>
+          <w:sz w:val="28"/>
+          <w:szCs w:val="28"/>
+        </w:rPr>
+      </w:pPr>
+      <w:r>
+        <w:rPr>
+          <w:rFonts w:ascii="Calibri" w:hAnsi="Calibri" w:cs="Calibri"/>
+          <w:b/>
+          <w:bCs/>
+          <w:sz w:val="28"/>
+          <w:szCs w:val="28"/>
+        </w:rPr>
+        <w:t>Cálculo de dosis de construcción</w:t>
+      </w:r>
+      <w:r>
+        <w:rPr>
+          <w:rFonts w:ascii="Calibri" w:hAnsi="Calibri" w:cs="Calibri"/>
+          <w:sz w:val="28"/>
+          <w:szCs w:val="28"/>
+        </w:rPr>
+        <w:t>:</w:t>
+      </w:r>
+    </w:p>
+    <w:p>
+      <w:pPr>
+        <w:numPr>
+          <w:ilvl w:val="2"/>
+          <w:numId w:val="5"/>
+        </w:numPr>
+        <w:rPr>
+          <w:rFonts w:ascii="Calibri" w:hAnsi="Calibri" w:cs="Calibri"/>
+          <w:sz w:val="28"/>
+          <w:szCs w:val="28"/>
+        </w:rPr>
+      </w:pPr>
+      <w:r>
+        <w:rPr>
+          <w:rFonts w:ascii="Calibri" w:hAnsi="Calibri" w:cs="Calibri"/>
+          <w:sz w:val="28"/>
+          <w:szCs w:val="28"/>
+        </w:rPr>
+        <w:t xml:space="preserve">Nivel de </w:t>
+      </w:r>
+      <w:r>
+        <w:rPr>
+          <w:rFonts w:ascii="Calibri" w:hAnsi="Calibri" w:cs="Calibri"/>
+          <w:sz w:val="28"/>
+          <w:szCs w:val="28"/>
+        </w:rPr>
+        <w:t>K</w:t>
+      </w:r>
+      <w:r>
+        <w:rPr>
+          <w:rFonts w:ascii="Calibri" w:hAnsi="Calibri" w:cs="Calibri"/>
+          <w:sz w:val="28"/>
+          <w:szCs w:val="28"/>
+        </w:rPr>
+        <w:t xml:space="preserve"> objetivo (ppm).</w:t>
+      </w:r>
+      <w:r>
+        <w:rPr>
+          <w:rFonts w:ascii="Calibri" w:hAnsi="Calibri" w:cs="Calibri"/>
+          <w:sz w:val="28"/>
+          <w:szCs w:val="28"/>
+        </w:rPr>
+        <w:t xml:space="preserve"> Puede ingresar valores propios o u</w:t>
+      </w:r>
+      <w:r>
+        <w:rPr>
+          <w:rFonts w:ascii="Calibri" w:hAnsi="Calibri" w:cs="Calibri"/>
+          <w:sz w:val="28"/>
+          <w:szCs w:val="28"/>
+        </w:rPr>
+        <w:t>sa</w:t>
+      </w:r>
+      <w:r>
+        <w:rPr>
+          <w:rFonts w:ascii="Calibri" w:hAnsi="Calibri" w:cs="Calibri"/>
+          <w:sz w:val="28"/>
+          <w:szCs w:val="28"/>
+        </w:rPr>
+        <w:t>s los</w:t>
+      </w:r>
+      <w:r>
+        <w:rPr>
+          <w:rFonts w:ascii="Calibri" w:hAnsi="Calibri" w:cs="Calibri"/>
+          <w:sz w:val="28"/>
+          <w:szCs w:val="28"/>
+        </w:rPr>
+        <w:t xml:space="preserve"> valores predeterminados</w:t>
+      </w:r>
+      <w:r>
+        <w:rPr>
+          <w:rFonts w:ascii="Calibri" w:hAnsi="Calibri" w:cs="Calibri"/>
+          <w:sz w:val="28"/>
+          <w:szCs w:val="28"/>
+        </w:rPr>
+        <w:t xml:space="preserve"> (</w:t>
+      </w:r>
+      <w:r>
+        <w:rPr>
+          <w:rFonts w:ascii="Calibri" w:hAnsi="Calibri" w:cs="Calibri"/>
+          <w:b/>
+          <w:sz w:val="28"/>
+          <w:szCs w:val="28"/>
+        </w:rPr>
+        <w:t>Tabla 2</w:t>
+      </w:r>
+      <w:r>
+        <w:rPr>
+          <w:rFonts w:ascii="Calibri" w:hAnsi="Calibri" w:cs="Calibri"/>
+          <w:sz w:val="28"/>
+          <w:szCs w:val="28"/>
+        </w:rPr>
+        <w:t>)</w:t>
+      </w:r>
+      <w:r>
+        <w:rPr>
+          <w:rFonts w:ascii="Calibri" w:hAnsi="Calibri" w:cs="Calibri"/>
+          <w:sz w:val="28"/>
+          <w:szCs w:val="28"/>
+        </w:rPr>
+        <w:t>.</w:t>
+      </w:r>
+    </w:p>
+    <w:p>
+      <w:pPr>
+        <w:numPr>
+          <w:ilvl w:val="2"/>
+          <w:numId w:val="4"/>
+        </w:numPr>
+        <w:rPr>
+          <w:rFonts w:ascii="Calibri" w:hAnsi="Calibri" w:cs="Calibri"/>
+          <w:sz w:val="28"/>
+          <w:szCs w:val="28"/>
+        </w:rPr>
+      </w:pPr>
+      <w:r>
+        <w:rPr>
+          <w:rFonts w:ascii="Calibri" w:hAnsi="Calibri" w:cs="Calibri"/>
+          <w:sz w:val="28"/>
+          <w:szCs w:val="28"/>
+        </w:rPr>
+        <w:t xml:space="preserve">Factor de construcción (kg </w:t>
+      </w:r>
+      <w:r>
+        <w:rPr>
+          <w:rFonts w:ascii="Calibri" w:hAnsi="Calibri" w:cs="Calibri"/>
+          <w:sz w:val="28"/>
+          <w:szCs w:val="28"/>
+        </w:rPr>
+        <w:t>K</w:t>
+      </w:r>
+      <w:r>
+        <w:rPr>
+          <w:rFonts w:ascii="Calibri" w:hAnsi="Calibri" w:cs="Calibri"/>
+          <w:sz w:val="28"/>
+          <w:szCs w:val="28"/>
+        </w:rPr>
+        <w:t>/ppm). Puede ingresar valores propios o usas los valores predeterminados (</w:t>
+      </w:r>
+      <w:r>
+        <w:rPr>
+          <w:rFonts w:ascii="Calibri" w:hAnsi="Calibri" w:cs="Calibri"/>
+          <w:b/>
+          <w:sz w:val="28"/>
+          <w:szCs w:val="28"/>
+        </w:rPr>
+        <w:t>Tabla 2</w:t>
+      </w:r>
+      <w:r>
+        <w:rPr>
+          <w:rFonts w:ascii="Calibri" w:hAnsi="Calibri" w:cs="Calibri"/>
+          <w:sz w:val="28"/>
+          <w:szCs w:val="28"/>
+        </w:rPr>
+        <w:t>).</w:t>
+      </w:r>
+    </w:p>
+    <w:p>
+      <w:pPr>
+        <w:pStyle w:val="Prrafodelista"/>
+        <w:numPr>
+          <w:ilvl w:val="2"/>
+          <w:numId w:val="4"/>
+        </w:numPr>
+        <w:rPr>
+          <w:rFonts w:ascii="Calibri" w:hAnsi="Calibri" w:cs="Calibri"/>
+          <w:sz w:val="28"/>
+          <w:szCs w:val="28"/>
+        </w:rPr>
+      </w:pPr>
+      <w:r>
+        <w:rPr>
+          <w:rFonts w:ascii="Calibri" w:hAnsi="Calibri" w:cs="Calibri"/>
+          <w:sz w:val="28"/>
+          <w:szCs w:val="28"/>
+        </w:rPr>
+        <w:t xml:space="preserve">La dosis de construcción no es necesario aplicarla en un solo </w:t>
+      </w:r>
+      <w:proofErr w:type="gramStart"/>
+      <w:r>
+        <w:rPr>
+          <w:rFonts w:ascii="Calibri" w:hAnsi="Calibri" w:cs="Calibri"/>
+          <w:sz w:val="28"/>
+          <w:szCs w:val="28"/>
+        </w:rPr>
+        <w:t>año</w:t>
+      </w:r>
+      <w:proofErr w:type="gramEnd"/>
+      <w:r>
+        <w:rPr>
+          <w:rFonts w:ascii="Calibri" w:hAnsi="Calibri" w:cs="Calibri"/>
+          <w:sz w:val="28"/>
+          <w:szCs w:val="28"/>
+        </w:rPr>
+        <w:t xml:space="preserve"> sino que dependerá de diferentes factores (relación </w:t>
+      </w:r>
+      <w:proofErr w:type="spellStart"/>
+      <w:proofErr w:type="gramStart"/>
+      <w:r>
+        <w:rPr>
+          <w:rFonts w:ascii="Calibri" w:hAnsi="Calibri" w:cs="Calibri"/>
+          <w:sz w:val="28"/>
+          <w:szCs w:val="28"/>
+        </w:rPr>
+        <w:t>insumo:producto</w:t>
+      </w:r>
+      <w:proofErr w:type="spellEnd"/>
+      <w:proofErr w:type="gramEnd"/>
+      <w:r>
+        <w:rPr>
+          <w:rFonts w:ascii="Calibri" w:hAnsi="Calibri" w:cs="Calibri"/>
+          <w:sz w:val="28"/>
+          <w:szCs w:val="28"/>
+        </w:rPr>
+        <w:t xml:space="preserve">, logística, cultivo, </w:t>
+      </w:r>
+      <w:proofErr w:type="spellStart"/>
+      <w:r>
+        <w:rPr>
+          <w:rFonts w:ascii="Calibri" w:hAnsi="Calibri" w:cs="Calibri"/>
+          <w:sz w:val="28"/>
+          <w:szCs w:val="28"/>
+        </w:rPr>
+        <w:t>etc</w:t>
+      </w:r>
+      <w:proofErr w:type="spellEnd"/>
+      <w:r>
+        <w:rPr>
+          <w:rFonts w:ascii="Calibri" w:hAnsi="Calibri" w:cs="Calibri"/>
+          <w:sz w:val="28"/>
+          <w:szCs w:val="28"/>
+        </w:rPr>
+        <w:t>…</w:t>
+      </w:r>
+      <w:r>
+        <w:rPr>
+          <w:rFonts w:ascii="Calibri" w:hAnsi="Calibri" w:cs="Calibri"/>
+          <w:sz w:val="28"/>
+          <w:szCs w:val="28"/>
+        </w:rPr>
+        <w:t>)</w:t>
+      </w:r>
+    </w:p>
+    <w:p>
+      <w:pPr>
+        <w:ind w:left="2160"/>
+        <w:rPr>
+          <w:rFonts w:ascii="Calibri" w:hAnsi="Calibri" w:cs="Calibri"/>
+          <w:sz w:val="28"/>
+          <w:szCs w:val="28"/>
+        </w:rPr>
+      </w:pPr>
+    </w:p>
+    <w:p>
+      <w:pPr>
+        <w:numPr>
+          <w:ilvl w:val="1"/>
+          <w:numId w:val="5"/>
+        </w:numPr>
+        <w:rPr>
+          <w:rFonts w:ascii="Calibri" w:hAnsi="Calibri" w:cs="Calibri"/>
+          <w:sz w:val="28"/>
+          <w:szCs w:val="28"/>
+        </w:rPr>
+      </w:pPr>
+      <w:r>
+        <w:rPr>
+          <w:rFonts w:ascii="Calibri" w:hAnsi="Calibri" w:cs="Calibri"/>
+          <w:b/>
+          <w:bCs/>
+          <w:sz w:val="28"/>
+          <w:szCs w:val="28"/>
+        </w:rPr>
+        <w:t>Cálculo de dosis de mantenimiento</w:t>
+      </w:r>
+      <w:r>
+        <w:rPr>
+          <w:rFonts w:ascii="Calibri" w:hAnsi="Calibri" w:cs="Calibri"/>
+          <w:sz w:val="28"/>
+          <w:szCs w:val="28"/>
+        </w:rPr>
+        <w:t>:</w:t>
+      </w:r>
+    </w:p>
+    <w:p>
+      <w:pPr>
+        <w:numPr>
+          <w:ilvl w:val="2"/>
+          <w:numId w:val="5"/>
+        </w:numPr>
+        <w:rPr>
+          <w:rFonts w:ascii="Calibri" w:hAnsi="Calibri" w:cs="Calibri"/>
+          <w:sz w:val="28"/>
+          <w:szCs w:val="28"/>
+        </w:rPr>
+      </w:pPr>
+      <w:r>
+        <w:rPr>
+          <w:rFonts w:ascii="Calibri" w:hAnsi="Calibri" w:cs="Calibri"/>
+          <w:sz w:val="28"/>
+          <w:szCs w:val="28"/>
+        </w:rPr>
+        <w:t>Rendimiento objetivo (t/ha).</w:t>
+      </w:r>
+    </w:p>
+    <w:p>
+      <w:pPr>
+        <w:numPr>
+          <w:ilvl w:val="2"/>
+          <w:numId w:val="4"/>
+        </w:numPr>
+        <w:rPr>
+          <w:rFonts w:ascii="Calibri" w:hAnsi="Calibri" w:cs="Calibri"/>
+          <w:sz w:val="28"/>
+          <w:szCs w:val="28"/>
+        </w:rPr>
+      </w:pPr>
+      <w:r>
+        <w:rPr>
+          <w:rFonts w:ascii="Calibri" w:hAnsi="Calibri" w:cs="Calibri"/>
+          <w:sz w:val="28"/>
+          <w:szCs w:val="28"/>
+        </w:rPr>
+        <w:t>Extracción de n</w:t>
+      </w:r>
+      <w:r>
+        <w:rPr>
+          <w:rFonts w:ascii="Calibri" w:hAnsi="Calibri" w:cs="Calibri"/>
+          <w:sz w:val="28"/>
+          <w:szCs w:val="28"/>
+        </w:rPr>
+        <w:t xml:space="preserve">utriente en grano (kg </w:t>
+      </w:r>
+      <w:r>
+        <w:rPr>
+          <w:rFonts w:ascii="Calibri" w:hAnsi="Calibri" w:cs="Calibri"/>
+          <w:sz w:val="28"/>
+          <w:szCs w:val="28"/>
+        </w:rPr>
+        <w:t>K</w:t>
+      </w:r>
+      <w:r>
+        <w:rPr>
+          <w:rFonts w:ascii="Calibri" w:hAnsi="Calibri" w:cs="Calibri"/>
+          <w:sz w:val="28"/>
+          <w:szCs w:val="28"/>
+        </w:rPr>
+        <w:t>/t).</w:t>
+      </w:r>
+      <w:r>
+        <w:rPr>
+          <w:rFonts w:ascii="Calibri" w:hAnsi="Calibri" w:cs="Calibri"/>
+          <w:sz w:val="28"/>
+          <w:szCs w:val="28"/>
+        </w:rPr>
+        <w:t xml:space="preserve"> Puede ingresar valores propios o u</w:t>
+      </w:r>
+      <w:r>
+        <w:rPr>
+          <w:rFonts w:ascii="Calibri" w:hAnsi="Calibri" w:cs="Calibri"/>
+          <w:sz w:val="28"/>
+          <w:szCs w:val="28"/>
+        </w:rPr>
+        <w:t>sa</w:t>
+      </w:r>
+      <w:r>
+        <w:rPr>
+          <w:rFonts w:ascii="Calibri" w:hAnsi="Calibri" w:cs="Calibri"/>
+          <w:sz w:val="28"/>
+          <w:szCs w:val="28"/>
+        </w:rPr>
+        <w:t>s los</w:t>
+      </w:r>
+      <w:r>
+        <w:rPr>
+          <w:rFonts w:ascii="Calibri" w:hAnsi="Calibri" w:cs="Calibri"/>
+          <w:sz w:val="28"/>
+          <w:szCs w:val="28"/>
+        </w:rPr>
+        <w:t xml:space="preserve"> valores predeterminados</w:t>
+      </w:r>
+      <w:r>
+        <w:rPr>
+          <w:rFonts w:ascii="Calibri" w:hAnsi="Calibri" w:cs="Calibri"/>
+          <w:sz w:val="28"/>
+          <w:szCs w:val="28"/>
+        </w:rPr>
+        <w:t xml:space="preserve"> (</w:t>
+      </w:r>
+      <w:r>
+        <w:rPr>
+          <w:rFonts w:ascii="Calibri" w:hAnsi="Calibri" w:cs="Calibri"/>
+          <w:b/>
+          <w:sz w:val="28"/>
+          <w:szCs w:val="28"/>
+        </w:rPr>
+        <w:t>Tabla 2</w:t>
+      </w:r>
+      <w:r>
+        <w:rPr>
+          <w:rFonts w:ascii="Calibri" w:hAnsi="Calibri" w:cs="Calibri"/>
+          <w:sz w:val="28"/>
+          <w:szCs w:val="28"/>
+        </w:rPr>
+        <w:t>)</w:t>
+      </w:r>
+      <w:r>
+        <w:rPr>
+          <w:rFonts w:ascii="Calibri" w:hAnsi="Calibri" w:cs="Calibri"/>
+          <w:sz w:val="28"/>
+          <w:szCs w:val="28"/>
+        </w:rPr>
+        <w:t>.</w:t>
+      </w:r>
+    </w:p>
+    <w:p>
+      <w:pPr>
+        <w:ind w:left="2160"/>
+        <w:rPr>
+          <w:rFonts w:ascii="Calibri" w:hAnsi="Calibri" w:cs="Calibri"/>
+          <w:sz w:val="28"/>
+          <w:szCs w:val="28"/>
+        </w:rPr>
+      </w:pPr>
+    </w:p>
+    <w:p>
+      <w:pPr>
+        <w:numPr>
+          <w:ilvl w:val="1"/>
+          <w:numId w:val="4"/>
+        </w:numPr>
+        <w:rPr>
+          <w:rFonts w:ascii="Calibri" w:hAnsi="Calibri" w:cs="Calibri"/>
+          <w:sz w:val="28"/>
+          <w:szCs w:val="28"/>
+        </w:rPr>
+      </w:pPr>
+      <w:r>
+        <w:rPr>
+          <w:rFonts w:ascii="Calibri" w:hAnsi="Calibri" w:cs="Calibri"/>
+          <w:b/>
+          <w:bCs/>
+          <w:sz w:val="28"/>
+          <w:szCs w:val="28"/>
+        </w:rPr>
+        <w:t>Resultados mostrados</w:t>
+      </w:r>
+      <w:r>
+        <w:rPr>
+          <w:rFonts w:ascii="Calibri" w:hAnsi="Calibri" w:cs="Calibri"/>
+          <w:sz w:val="28"/>
+          <w:szCs w:val="28"/>
+        </w:rPr>
+        <w:t xml:space="preserve">: Dosis de construcción y mantenimiento (kg </w:t>
+      </w:r>
+      <w:r>
+        <w:rPr>
+          <w:rFonts w:ascii="Calibri" w:hAnsi="Calibri" w:cs="Calibri"/>
+          <w:sz w:val="28"/>
+          <w:szCs w:val="28"/>
+        </w:rPr>
+        <w:t>K</w:t>
+      </w:r>
+      <w:r>
+        <w:rPr>
+          <w:rFonts w:ascii="Calibri" w:hAnsi="Calibri" w:cs="Calibri"/>
+          <w:sz w:val="28"/>
+          <w:szCs w:val="28"/>
+        </w:rPr>
+        <w:t>/ha).</w:t>
+      </w:r>
+    </w:p>
+    <w:p>
+      <w:pPr>
+        <w:ind w:left="2160"/>
+        <w:rPr>
+          <w:rFonts w:ascii="Calibri" w:hAnsi="Calibri" w:cs="Calibri"/>
+          <w:sz w:val="28"/>
+          <w:szCs w:val="28"/>
+        </w:rPr>
+      </w:pPr>
+    </w:p>
+    <w:p>
+      <w:pPr>
+        <w:ind w:left="2160"/>
+        <w:rPr>
+          <w:rFonts w:ascii="Calibri" w:hAnsi="Calibri" w:cs="Calibri"/>
+          <w:sz w:val="28"/>
+          <w:szCs w:val="28"/>
+        </w:rPr>
+      </w:pPr>
+    </w:p>
+    <w:p>
+      <w:pPr>
+        <w:pStyle w:val="Prrafodelista"/>
+        <w:rPr>
+          <w:rFonts w:ascii="Calibri" w:hAnsi="Calibri" w:cs="Calibri"/>
+          <w:sz w:val="36"/>
+          <w:szCs w:val="28"/>
+        </w:rPr>
+      </w:pPr>
+      <w:r>
+        <w:rPr>
+          <w:rFonts w:ascii="Calibri" w:hAnsi="Calibri" w:cs="Calibri"/>
+          <w:b/>
+          <w:szCs w:val="20"/>
+        </w:rPr>
+        <w:t>Tabla 2.</w:t>
+      </w:r>
+      <w:r>
+        <w:rPr>
+          <w:rFonts w:ascii="Calibri" w:hAnsi="Calibri" w:cs="Calibri"/>
+          <w:szCs w:val="20"/>
+        </w:rPr>
+        <w:t xml:space="preserve"> Valores determinados para cálculo de dosis de construcción y mantenimiento en P.</w:t>
+      </w:r>
+    </w:p>
+    <w:tbl>
+      <w:tblPr>
+        <w:tblW w:w="6485" w:type="dxa"/>
+        <w:jc w:val="center"/>
+        <w:tblCellMar>
+          <w:left w:w="70" w:type="dxa"/>
+          <w:right w:w="70" w:type="dxa"/>
+        </w:tblCellMar>
+        <w:tblLook w:val="04A0" w:firstRow="1" w:lastRow="0" w:firstColumn="1" w:lastColumn="0" w:noHBand="0" w:noVBand="1"/>
+      </w:tblPr>
+      <w:tblGrid>
+        <w:gridCol w:w="1718"/>
+        <w:gridCol w:w="2270"/>
+        <w:gridCol w:w="2497"/>
+      </w:tblGrid>
+      <w:tr>
+        <w:trPr>
+          <w:trHeight w:val="300"/>
+          <w:jc w:val="center"/>
+        </w:trPr>
+        <w:tc>
+          <w:tcPr>
+            <w:tcW w:w="6485" w:type="dxa"/>
+            <w:gridSpan w:val="3"/>
+            <w:tcBorders>
+              <w:top w:val="single" w:sz="12" w:space="0" w:color="auto"/>
+              <w:bottom w:val="single" w:sz="4" w:space="0" w:color="auto"/>
+            </w:tcBorders>
+            <w:shd w:val="clear" w:color="auto" w:fill="auto"/>
+            <w:noWrap/>
+            <w:vAlign w:val="bottom"/>
+            <w:hideMark/>
+          </w:tcPr>
+          <w:p>
+            <w:pPr>
+              <w:spacing w:after="0" w:line="240" w:lineRule="auto"/>
+              <w:jc w:val="center"/>
+              <w:rPr>
+                <w:rFonts w:ascii="Aptos Narrow" w:eastAsia="Times New Roman" w:hAnsi="Aptos Narrow" w:cs="Times New Roman"/>
+                <w:color w:val="000000"/>
+                <w:kern w:val="0"/>
+                <w:sz w:val="22"/>
+                <w:szCs w:val="22"/>
+                <w:lang w:eastAsia="es-AR"/>
+                <w14:ligatures w14:val="none"/>
+              </w:rPr>
+            </w:pPr>
+            <w:r>
+              <w:rPr>
+                <w:rFonts w:ascii="Aptos Narrow" w:eastAsia="Times New Roman" w:hAnsi="Aptos Narrow" w:cs="Times New Roman"/>
+                <w:b/>
+                <w:bCs/>
+                <w:color w:val="000000"/>
+                <w:kern w:val="0"/>
+                <w:sz w:val="22"/>
+                <w:szCs w:val="22"/>
+                <w:lang w:eastAsia="es-AR"/>
+                <w14:ligatures w14:val="none"/>
+              </w:rPr>
+              <w:t>POTASIO</w:t>
+            </w:r>
+            <w:r>
+              <w:rPr>
+                <w:rFonts w:ascii="Aptos Narrow" w:eastAsia="Times New Roman" w:hAnsi="Aptos Narrow" w:cs="Times New Roman"/>
+                <w:color w:val="000000"/>
+                <w:kern w:val="0"/>
+                <w:sz w:val="22"/>
+                <w:szCs w:val="22"/>
+                <w:lang w:eastAsia="es-AR"/>
+                <w14:ligatures w14:val="none"/>
+              </w:rPr>
+              <w:t> </w:t>
+            </w:r>
+          </w:p>
+        </w:tc>
+      </w:tr>
+      <w:tr>
+        <w:trPr>
+          <w:trHeight w:val="300"/>
+          <w:jc w:val="center"/>
+        </w:trPr>
+        <w:tc>
+          <w:tcPr>
+            <w:tcW w:w="1718" w:type="dxa"/>
+            <w:tcBorders>
+              <w:top w:val="nil"/>
+              <w:bottom w:val="nil"/>
+              <w:right w:val="nil"/>
+            </w:tcBorders>
+            <w:shd w:val="clear" w:color="auto" w:fill="auto"/>
+            <w:noWrap/>
+            <w:hideMark/>
+          </w:tcPr>
+          <w:p>
+            <w:pPr>
+              <w:spacing w:after="0" w:line="240" w:lineRule="auto"/>
+              <w:rPr>
+                <w:rFonts w:ascii="Aptos Narrow" w:eastAsia="Times New Roman" w:hAnsi="Aptos Narrow" w:cs="Times New Roman"/>
+                <w:b/>
+                <w:color w:val="000000"/>
+                <w:kern w:val="0"/>
+                <w:sz w:val="22"/>
+                <w:szCs w:val="22"/>
+                <w:lang w:eastAsia="es-AR"/>
+                <w14:ligatures w14:val="none"/>
+              </w:rPr>
+            </w:pPr>
+            <w:r>
+              <w:rPr>
+                <w:rFonts w:ascii="Aptos Narrow" w:eastAsia="Times New Roman" w:hAnsi="Aptos Narrow" w:cs="Times New Roman"/>
+                <w:b/>
+                <w:color w:val="000000"/>
+                <w:kern w:val="0"/>
+                <w:sz w:val="22"/>
+                <w:szCs w:val="22"/>
+                <w:lang w:eastAsia="es-AR"/>
+                <w14:ligatures w14:val="none"/>
+              </w:rPr>
+              <w:t>Cultivo</w:t>
+            </w:r>
+          </w:p>
+        </w:tc>
+        <w:tc>
+          <w:tcPr>
+            <w:tcW w:w="2270" w:type="dxa"/>
+            <w:tcBorders>
+              <w:top w:val="nil"/>
+              <w:left w:val="nil"/>
+              <w:bottom w:val="nil"/>
+              <w:right w:val="nil"/>
+            </w:tcBorders>
+            <w:shd w:val="clear" w:color="auto" w:fill="auto"/>
+            <w:noWrap/>
+            <w:vAlign w:val="bottom"/>
+            <w:hideMark/>
+          </w:tcPr>
+          <w:p>
+            <w:pPr>
+              <w:spacing w:after="0" w:line="240" w:lineRule="auto"/>
+              <w:jc w:val="center"/>
+              <w:rPr>
+                <w:rFonts w:ascii="Aptos Narrow" w:eastAsia="Times New Roman" w:hAnsi="Aptos Narrow" w:cs="Times New Roman"/>
+                <w:b/>
+                <w:bCs/>
+                <w:color w:val="000000"/>
+                <w:kern w:val="0"/>
+                <w:sz w:val="22"/>
+                <w:szCs w:val="22"/>
+                <w:lang w:eastAsia="es-AR"/>
+                <w14:ligatures w14:val="none"/>
+              </w:rPr>
+            </w:pPr>
+            <w:r>
+              <w:rPr>
+                <w:rFonts w:ascii="Aptos Narrow" w:eastAsia="Times New Roman" w:hAnsi="Aptos Narrow" w:cs="Times New Roman"/>
+                <w:b/>
+                <w:bCs/>
+                <w:color w:val="000000"/>
+                <w:kern w:val="0"/>
+                <w:sz w:val="22"/>
+                <w:szCs w:val="22"/>
+                <w:lang w:eastAsia="es-AR"/>
+                <w14:ligatures w14:val="none"/>
+              </w:rPr>
+              <w:t xml:space="preserve">Factor construcción </w:t>
+            </w:r>
+            <w:r>
+              <w:rPr>
+                <w:rFonts w:ascii="Aptos Narrow" w:eastAsia="Times New Roman" w:hAnsi="Aptos Narrow" w:cs="Times New Roman"/>
+                <w:b/>
+                <w:bCs/>
+                <w:color w:val="000000"/>
+                <w:kern w:val="0"/>
+                <w:sz w:val="22"/>
+                <w:szCs w:val="22"/>
+                <w:lang w:eastAsia="es-AR"/>
+                <w14:ligatures w14:val="none"/>
+              </w:rPr>
+              <w:br/>
+            </w:r>
+            <w:r>
+              <w:rPr>
+                <w:rFonts w:ascii="Aptos Narrow" w:eastAsia="Times New Roman" w:hAnsi="Aptos Narrow" w:cs="Times New Roman"/>
+                <w:b/>
+                <w:bCs/>
+                <w:color w:val="000000"/>
+                <w:kern w:val="0"/>
+                <w:sz w:val="22"/>
+                <w:szCs w:val="22"/>
+                <w:lang w:eastAsia="es-AR"/>
+                <w14:ligatures w14:val="none"/>
+              </w:rPr>
+              <w:t xml:space="preserve">(kg </w:t>
+            </w:r>
+            <w:r>
+              <w:rPr>
+                <w:rFonts w:ascii="Aptos Narrow" w:eastAsia="Times New Roman" w:hAnsi="Aptos Narrow" w:cs="Times New Roman"/>
+                <w:b/>
+                <w:bCs/>
+                <w:color w:val="000000"/>
+                <w:kern w:val="0"/>
+                <w:sz w:val="22"/>
+                <w:szCs w:val="22"/>
+                <w:lang w:eastAsia="es-AR"/>
+                <w14:ligatures w14:val="none"/>
+              </w:rPr>
+              <w:t>K</w:t>
+            </w:r>
+            <w:r>
+              <w:rPr>
+                <w:rFonts w:ascii="Aptos Narrow" w:eastAsia="Times New Roman" w:hAnsi="Aptos Narrow" w:cs="Times New Roman"/>
+                <w:b/>
+                <w:bCs/>
+                <w:color w:val="000000"/>
+                <w:kern w:val="0"/>
+                <w:sz w:val="22"/>
+                <w:szCs w:val="22"/>
+                <w:lang w:eastAsia="es-AR"/>
+                <w14:ligatures w14:val="none"/>
+              </w:rPr>
+              <w:t>/ ppm)</w:t>
+            </w:r>
+          </w:p>
+        </w:tc>
+        <w:tc>
+          <w:tcPr>
+            <w:tcW w:w="2497" w:type="dxa"/>
+            <w:tcBorders>
+              <w:top w:val="nil"/>
+              <w:left w:val="nil"/>
+              <w:bottom w:val="nil"/>
+            </w:tcBorders>
+            <w:shd w:val="clear" w:color="auto" w:fill="auto"/>
+            <w:noWrap/>
+            <w:vAlign w:val="bottom"/>
+            <w:hideMark/>
+          </w:tcPr>
+          <w:p>
+            <w:pPr>
+              <w:spacing w:after="0" w:line="240" w:lineRule="auto"/>
+              <w:jc w:val="center"/>
+              <w:rPr>
+                <w:rFonts w:ascii="Aptos Narrow" w:eastAsia="Times New Roman" w:hAnsi="Aptos Narrow" w:cs="Times New Roman"/>
+                <w:b/>
+                <w:bCs/>
+                <w:color w:val="000000"/>
+                <w:kern w:val="0"/>
+                <w:sz w:val="22"/>
+                <w:szCs w:val="22"/>
+                <w:lang w:eastAsia="es-AR"/>
+                <w14:ligatures w14:val="none"/>
+              </w:rPr>
+            </w:pPr>
+            <w:r>
+              <w:rPr>
+                <w:rFonts w:ascii="Aptos Narrow" w:eastAsia="Times New Roman" w:hAnsi="Aptos Narrow" w:cs="Times New Roman"/>
+                <w:b/>
+                <w:bCs/>
+                <w:color w:val="000000"/>
+                <w:kern w:val="0"/>
+                <w:sz w:val="22"/>
+                <w:szCs w:val="22"/>
+                <w:lang w:eastAsia="es-AR"/>
+                <w14:ligatures w14:val="none"/>
+              </w:rPr>
+              <w:t>Extracción en grano</w:t>
+            </w:r>
+            <w:r>
+              <w:rPr>
+                <w:rFonts w:ascii="Aptos Narrow" w:eastAsia="Times New Roman" w:hAnsi="Aptos Narrow" w:cs="Times New Roman"/>
+                <w:b/>
+                <w:bCs/>
+                <w:color w:val="000000"/>
+                <w:kern w:val="0"/>
+                <w:sz w:val="22"/>
+                <w:szCs w:val="22"/>
+                <w:lang w:eastAsia="es-AR"/>
+                <w14:ligatures w14:val="none"/>
+              </w:rPr>
+              <w:t xml:space="preserve"> </w:t>
+            </w:r>
+            <w:r>
+              <w:rPr>
+                <w:rFonts w:ascii="Aptos Narrow" w:eastAsia="Times New Roman" w:hAnsi="Aptos Narrow" w:cs="Times New Roman"/>
+                <w:b/>
+                <w:bCs/>
+                <w:color w:val="000000"/>
+                <w:kern w:val="0"/>
+                <w:sz w:val="22"/>
+                <w:szCs w:val="22"/>
+                <w:lang w:eastAsia="es-AR"/>
+                <w14:ligatures w14:val="none"/>
+              </w:rPr>
+              <w:br/>
+            </w:r>
+            <w:r>
+              <w:rPr>
+                <w:rFonts w:ascii="Aptos Narrow" w:eastAsia="Times New Roman" w:hAnsi="Aptos Narrow" w:cs="Times New Roman"/>
+                <w:b/>
+                <w:bCs/>
+                <w:color w:val="000000"/>
+                <w:kern w:val="0"/>
+                <w:sz w:val="22"/>
+                <w:szCs w:val="22"/>
+                <w:lang w:eastAsia="es-AR"/>
+                <w14:ligatures w14:val="none"/>
+              </w:rPr>
+              <w:t xml:space="preserve">(kg </w:t>
+            </w:r>
+            <w:r>
+              <w:rPr>
+                <w:rFonts w:ascii="Aptos Narrow" w:eastAsia="Times New Roman" w:hAnsi="Aptos Narrow" w:cs="Times New Roman"/>
+                <w:b/>
+                <w:bCs/>
+                <w:color w:val="000000"/>
+                <w:kern w:val="0"/>
+                <w:sz w:val="22"/>
+                <w:szCs w:val="22"/>
+                <w:lang w:eastAsia="es-AR"/>
+                <w14:ligatures w14:val="none"/>
+              </w:rPr>
+              <w:t>K</w:t>
+            </w:r>
+            <w:r>
+              <w:rPr>
+                <w:rFonts w:ascii="Aptos Narrow" w:eastAsia="Times New Roman" w:hAnsi="Aptos Narrow" w:cs="Times New Roman"/>
+                <w:b/>
+                <w:bCs/>
+                <w:color w:val="000000"/>
+                <w:kern w:val="0"/>
+                <w:sz w:val="22"/>
+                <w:szCs w:val="22"/>
+                <w:lang w:eastAsia="es-AR"/>
+                <w14:ligatures w14:val="none"/>
+              </w:rPr>
+              <w:t>/ t)</w:t>
+            </w:r>
+          </w:p>
+        </w:tc>
+      </w:tr>
+      <w:tr>
+        <w:trPr>
+          <w:trHeight w:val="300"/>
+          <w:jc w:val="center"/>
+        </w:trPr>
+        <w:tc>
+          <w:tcPr>
+            <w:tcW w:w="1718" w:type="dxa"/>
+            <w:tcBorders>
+              <w:top w:val="nil"/>
+              <w:bottom w:val="nil"/>
+              <w:right w:val="nil"/>
+            </w:tcBorders>
+            <w:shd w:val="clear" w:color="auto" w:fill="auto"/>
+            <w:noWrap/>
+            <w:vAlign w:val="bottom"/>
+            <w:hideMark/>
+          </w:tcPr>
+          <w:p>
+            <w:pPr>
+              <w:spacing w:after="0" w:line="240" w:lineRule="auto"/>
+              <w:rPr>
+                <w:rFonts w:ascii="Aptos Narrow" w:eastAsia="Times New Roman" w:hAnsi="Aptos Narrow" w:cs="Times New Roman"/>
+                <w:color w:val="000000"/>
+                <w:kern w:val="0"/>
+                <w:sz w:val="22"/>
+                <w:szCs w:val="22"/>
+                <w:lang w:eastAsia="es-AR"/>
+                <w14:ligatures w14:val="none"/>
+              </w:rPr>
+            </w:pPr>
+            <w:r>
+              <w:rPr>
+                <w:rFonts w:ascii="Aptos Narrow" w:eastAsia="Times New Roman" w:hAnsi="Aptos Narrow" w:cs="Times New Roman"/>
+                <w:color w:val="000000"/>
+                <w:kern w:val="0"/>
+                <w:sz w:val="22"/>
+                <w:szCs w:val="22"/>
+                <w:lang w:eastAsia="es-AR"/>
+                <w14:ligatures w14:val="none"/>
+              </w:rPr>
+              <w:t>M</w:t>
+            </w:r>
+            <w:r>
+              <w:rPr>
+                <w:rFonts w:ascii="Aptos Narrow" w:eastAsia="Times New Roman" w:hAnsi="Aptos Narrow" w:cs="Times New Roman"/>
+                <w:color w:val="000000"/>
+                <w:kern w:val="0"/>
+                <w:sz w:val="22"/>
+                <w:szCs w:val="22"/>
+                <w:lang w:eastAsia="es-AR"/>
+                <w14:ligatures w14:val="none"/>
+              </w:rPr>
+              <w:t>aíz</w:t>
+            </w:r>
+          </w:p>
+        </w:tc>
+        <w:tc>
+          <w:tcPr>
+            <w:tcW w:w="2270" w:type="dxa"/>
+            <w:tcBorders>
+              <w:top w:val="nil"/>
+              <w:left w:val="nil"/>
+              <w:bottom w:val="nil"/>
+              <w:right w:val="nil"/>
+            </w:tcBorders>
+            <w:shd w:val="clear" w:color="auto" w:fill="auto"/>
+            <w:noWrap/>
+            <w:vAlign w:val="bottom"/>
+            <w:hideMark/>
+          </w:tcPr>
+          <w:p>
+            <w:pPr>
+              <w:spacing w:after="0" w:line="240" w:lineRule="auto"/>
+              <w:jc w:val="center"/>
+              <w:rPr>
+                <w:rFonts w:ascii="Aptos Narrow" w:eastAsia="Times New Roman" w:hAnsi="Aptos Narrow" w:cs="Times New Roman"/>
+                <w:color w:val="000000"/>
+                <w:kern w:val="0"/>
+                <w:sz w:val="22"/>
+                <w:szCs w:val="22"/>
+                <w:lang w:eastAsia="es-AR"/>
+                <w14:ligatures w14:val="none"/>
+              </w:rPr>
+            </w:pPr>
+            <w:r>
+              <w:rPr>
+                <w:rFonts w:ascii="Aptos Narrow" w:eastAsia="Times New Roman" w:hAnsi="Aptos Narrow" w:cs="Times New Roman"/>
+                <w:color w:val="000000"/>
+                <w:kern w:val="0"/>
+                <w:sz w:val="22"/>
+                <w:szCs w:val="22"/>
+                <w:lang w:eastAsia="es-AR"/>
+                <w14:ligatures w14:val="none"/>
+              </w:rPr>
+              <w:t>8</w:t>
+            </w:r>
+          </w:p>
+        </w:tc>
+        <w:tc>
+          <w:tcPr>
+            <w:tcW w:w="2497" w:type="dxa"/>
+            <w:tcBorders>
+              <w:top w:val="nil"/>
+              <w:left w:val="nil"/>
+              <w:bottom w:val="nil"/>
+            </w:tcBorders>
+            <w:shd w:val="clear" w:color="auto" w:fill="auto"/>
+            <w:noWrap/>
+            <w:vAlign w:val="bottom"/>
+            <w:hideMark/>
+          </w:tcPr>
+          <w:p>
+            <w:pPr>
+              <w:spacing w:after="0" w:line="240" w:lineRule="auto"/>
+              <w:jc w:val="center"/>
+              <w:rPr>
+                <w:rFonts w:ascii="Aptos Narrow" w:eastAsia="Times New Roman" w:hAnsi="Aptos Narrow" w:cs="Times New Roman"/>
+                <w:color w:val="000000"/>
+                <w:kern w:val="0"/>
+                <w:sz w:val="22"/>
+                <w:szCs w:val="22"/>
+                <w:lang w:eastAsia="es-AR"/>
+                <w14:ligatures w14:val="none"/>
+              </w:rPr>
+            </w:pPr>
+            <w:r>
+              <w:rPr>
+                <w:rFonts w:ascii="Aptos Narrow" w:eastAsia="Times New Roman" w:hAnsi="Aptos Narrow" w:cs="Times New Roman"/>
+                <w:color w:val="000000"/>
+                <w:kern w:val="0"/>
+                <w:sz w:val="22"/>
+                <w:szCs w:val="22"/>
+                <w:lang w:eastAsia="es-AR"/>
+                <w14:ligatures w14:val="none"/>
+              </w:rPr>
+              <w:t>3,0</w:t>
+            </w:r>
+          </w:p>
+        </w:tc>
+      </w:tr>
+      <w:tr>
+        <w:trPr>
+          <w:trHeight w:val="300"/>
+          <w:jc w:val="center"/>
+        </w:trPr>
+        <w:tc>
+          <w:tcPr>
+            <w:tcW w:w="1718" w:type="dxa"/>
+            <w:tcBorders>
+              <w:top w:val="nil"/>
+              <w:bottom w:val="nil"/>
+              <w:right w:val="nil"/>
+            </w:tcBorders>
+            <w:shd w:val="clear" w:color="auto" w:fill="auto"/>
+            <w:noWrap/>
+            <w:vAlign w:val="bottom"/>
+            <w:hideMark/>
+          </w:tcPr>
+          <w:p>
+            <w:pPr>
+              <w:spacing w:after="0" w:line="240" w:lineRule="auto"/>
+              <w:rPr>
+                <w:rFonts w:ascii="Aptos Narrow" w:eastAsia="Times New Roman" w:hAnsi="Aptos Narrow" w:cs="Times New Roman"/>
+                <w:color w:val="000000"/>
+                <w:kern w:val="0"/>
+                <w:sz w:val="22"/>
+                <w:szCs w:val="22"/>
+                <w:lang w:eastAsia="es-AR"/>
+                <w14:ligatures w14:val="none"/>
+              </w:rPr>
+            </w:pPr>
+            <w:r>
+              <w:rPr>
+                <w:rFonts w:ascii="Aptos Narrow" w:eastAsia="Times New Roman" w:hAnsi="Aptos Narrow" w:cs="Times New Roman"/>
+                <w:color w:val="000000"/>
+                <w:kern w:val="0"/>
+                <w:sz w:val="22"/>
+                <w:szCs w:val="22"/>
+                <w:lang w:eastAsia="es-AR"/>
+                <w14:ligatures w14:val="none"/>
+              </w:rPr>
+              <w:t>Trigo / Cebada</w:t>
+            </w:r>
+          </w:p>
+        </w:tc>
+        <w:tc>
+          <w:tcPr>
+            <w:tcW w:w="2270" w:type="dxa"/>
+            <w:tcBorders>
+              <w:top w:val="nil"/>
+              <w:left w:val="nil"/>
+              <w:bottom w:val="nil"/>
+              <w:right w:val="nil"/>
+            </w:tcBorders>
+            <w:shd w:val="clear" w:color="auto" w:fill="auto"/>
+            <w:noWrap/>
+            <w:vAlign w:val="bottom"/>
+            <w:hideMark/>
+          </w:tcPr>
+          <w:p>
+            <w:pPr>
+              <w:spacing w:after="0" w:line="240" w:lineRule="auto"/>
+              <w:jc w:val="center"/>
+              <w:rPr>
+                <w:rFonts w:ascii="Aptos Narrow" w:eastAsia="Times New Roman" w:hAnsi="Aptos Narrow" w:cs="Times New Roman"/>
+                <w:color w:val="000000"/>
+                <w:kern w:val="0"/>
+                <w:sz w:val="22"/>
+                <w:szCs w:val="22"/>
+                <w:lang w:eastAsia="es-AR"/>
+                <w14:ligatures w14:val="none"/>
+              </w:rPr>
+            </w:pPr>
+            <w:r>
+              <w:rPr>
+                <w:rFonts w:ascii="Aptos Narrow" w:eastAsia="Times New Roman" w:hAnsi="Aptos Narrow" w:cs="Times New Roman"/>
+                <w:color w:val="000000"/>
+                <w:kern w:val="0"/>
+                <w:sz w:val="22"/>
+                <w:szCs w:val="22"/>
+                <w:lang w:eastAsia="es-AR"/>
+                <w14:ligatures w14:val="none"/>
+              </w:rPr>
+              <w:t>8</w:t>
+            </w:r>
+          </w:p>
+        </w:tc>
+        <w:tc>
+          <w:tcPr>
+            <w:tcW w:w="2497" w:type="dxa"/>
+            <w:tcBorders>
+              <w:top w:val="nil"/>
+              <w:left w:val="nil"/>
+              <w:bottom w:val="nil"/>
+            </w:tcBorders>
+            <w:shd w:val="clear" w:color="auto" w:fill="auto"/>
+            <w:noWrap/>
+            <w:vAlign w:val="bottom"/>
+            <w:hideMark/>
+          </w:tcPr>
+          <w:p>
+            <w:pPr>
+              <w:spacing w:after="0" w:line="240" w:lineRule="auto"/>
+              <w:jc w:val="center"/>
+              <w:rPr>
+                <w:rFonts w:ascii="Aptos Narrow" w:eastAsia="Times New Roman" w:hAnsi="Aptos Narrow" w:cs="Times New Roman"/>
+                <w:color w:val="000000"/>
+                <w:kern w:val="0"/>
+                <w:sz w:val="22"/>
+                <w:szCs w:val="22"/>
+                <w:lang w:eastAsia="es-AR"/>
+                <w14:ligatures w14:val="none"/>
+              </w:rPr>
+            </w:pPr>
+            <w:r>
+              <w:rPr>
+                <w:rFonts w:ascii="Aptos Narrow" w:eastAsia="Times New Roman" w:hAnsi="Aptos Narrow" w:cs="Times New Roman"/>
+                <w:color w:val="000000"/>
+                <w:kern w:val="0"/>
+                <w:sz w:val="22"/>
+                <w:szCs w:val="22"/>
+                <w:lang w:eastAsia="es-AR"/>
+                <w14:ligatures w14:val="none"/>
+              </w:rPr>
+              <w:t>3,</w:t>
+            </w:r>
+            <w:r>
+              <w:rPr>
+                <w:rFonts w:ascii="Aptos Narrow" w:eastAsia="Times New Roman" w:hAnsi="Aptos Narrow" w:cs="Times New Roman"/>
+                <w:color w:val="000000"/>
+                <w:kern w:val="0"/>
+                <w:sz w:val="22"/>
+                <w:szCs w:val="22"/>
+                <w:lang w:eastAsia="es-AR"/>
+                <w14:ligatures w14:val="none"/>
+              </w:rPr>
+              <w:t>5</w:t>
+            </w:r>
+          </w:p>
+        </w:tc>
+      </w:tr>
+      <w:tr>
+        <w:trPr>
+          <w:trHeight w:val="300"/>
+          <w:jc w:val="center"/>
+        </w:trPr>
+        <w:tc>
+          <w:tcPr>
+            <w:tcW w:w="1718" w:type="dxa"/>
+            <w:tcBorders>
+              <w:top w:val="nil"/>
+              <w:bottom w:val="nil"/>
+              <w:right w:val="nil"/>
+            </w:tcBorders>
+            <w:shd w:val="clear" w:color="auto" w:fill="auto"/>
+            <w:noWrap/>
+            <w:vAlign w:val="bottom"/>
+            <w:hideMark/>
+          </w:tcPr>
+          <w:p>
+            <w:pPr>
+              <w:spacing w:after="0" w:line="240" w:lineRule="auto"/>
+              <w:rPr>
+                <w:rFonts w:ascii="Aptos Narrow" w:eastAsia="Times New Roman" w:hAnsi="Aptos Narrow" w:cs="Times New Roman"/>
+                <w:color w:val="000000"/>
+                <w:kern w:val="0"/>
+                <w:sz w:val="22"/>
+                <w:szCs w:val="22"/>
+                <w:lang w:eastAsia="es-AR"/>
+                <w14:ligatures w14:val="none"/>
+              </w:rPr>
+            </w:pPr>
+            <w:r>
+              <w:rPr>
+                <w:rFonts w:ascii="Aptos Narrow" w:eastAsia="Times New Roman" w:hAnsi="Aptos Narrow" w:cs="Times New Roman"/>
+                <w:color w:val="000000"/>
+                <w:kern w:val="0"/>
+                <w:sz w:val="22"/>
+                <w:szCs w:val="22"/>
+                <w:lang w:eastAsia="es-AR"/>
+                <w14:ligatures w14:val="none"/>
+              </w:rPr>
+              <w:t>Girasol</w:t>
+            </w:r>
+          </w:p>
+        </w:tc>
+        <w:tc>
+          <w:tcPr>
+            <w:tcW w:w="2270" w:type="dxa"/>
+            <w:tcBorders>
+              <w:top w:val="nil"/>
+              <w:left w:val="nil"/>
+              <w:bottom w:val="nil"/>
+              <w:right w:val="nil"/>
+            </w:tcBorders>
+            <w:shd w:val="clear" w:color="auto" w:fill="auto"/>
+            <w:noWrap/>
+            <w:vAlign w:val="bottom"/>
+            <w:hideMark/>
+          </w:tcPr>
+          <w:p>
+            <w:pPr>
+              <w:spacing w:after="0" w:line="240" w:lineRule="auto"/>
+              <w:jc w:val="center"/>
+              <w:rPr>
+                <w:rFonts w:ascii="Aptos Narrow" w:eastAsia="Times New Roman" w:hAnsi="Aptos Narrow" w:cs="Times New Roman"/>
+                <w:color w:val="000000"/>
+                <w:kern w:val="0"/>
+                <w:sz w:val="22"/>
+                <w:szCs w:val="22"/>
+                <w:lang w:eastAsia="es-AR"/>
+                <w14:ligatures w14:val="none"/>
+              </w:rPr>
+            </w:pPr>
+            <w:r>
+              <w:rPr>
+                <w:rFonts w:ascii="Aptos Narrow" w:eastAsia="Times New Roman" w:hAnsi="Aptos Narrow" w:cs="Times New Roman"/>
+                <w:color w:val="000000"/>
+                <w:kern w:val="0"/>
+                <w:sz w:val="22"/>
+                <w:szCs w:val="22"/>
+                <w:lang w:eastAsia="es-AR"/>
+                <w14:ligatures w14:val="none"/>
+              </w:rPr>
+              <w:t>8</w:t>
+            </w:r>
+          </w:p>
+        </w:tc>
+        <w:tc>
+          <w:tcPr>
+            <w:tcW w:w="2497" w:type="dxa"/>
+            <w:tcBorders>
+              <w:top w:val="nil"/>
+              <w:left w:val="nil"/>
+              <w:bottom w:val="nil"/>
+            </w:tcBorders>
+            <w:shd w:val="clear" w:color="auto" w:fill="auto"/>
+            <w:noWrap/>
+            <w:vAlign w:val="bottom"/>
+            <w:hideMark/>
+          </w:tcPr>
+          <w:p>
+            <w:pPr>
+              <w:spacing w:after="0" w:line="240" w:lineRule="auto"/>
+              <w:jc w:val="center"/>
+              <w:rPr>
+                <w:rFonts w:ascii="Aptos Narrow" w:eastAsia="Times New Roman" w:hAnsi="Aptos Narrow" w:cs="Times New Roman"/>
+                <w:color w:val="000000"/>
+                <w:kern w:val="0"/>
+                <w:sz w:val="22"/>
+                <w:szCs w:val="22"/>
+                <w:lang w:eastAsia="es-AR"/>
+                <w14:ligatures w14:val="none"/>
+              </w:rPr>
+            </w:pPr>
+            <w:r>
+              <w:rPr>
+                <w:rFonts w:ascii="Aptos Narrow" w:eastAsia="Times New Roman" w:hAnsi="Aptos Narrow" w:cs="Times New Roman"/>
+                <w:color w:val="000000"/>
+                <w:kern w:val="0"/>
+                <w:sz w:val="22"/>
+                <w:szCs w:val="22"/>
+                <w:lang w:eastAsia="es-AR"/>
+                <w14:ligatures w14:val="none"/>
+              </w:rPr>
+              <w:t>5</w:t>
+            </w:r>
+            <w:r>
+              <w:rPr>
+                <w:rFonts w:ascii="Aptos Narrow" w:eastAsia="Times New Roman" w:hAnsi="Aptos Narrow" w:cs="Times New Roman"/>
+                <w:color w:val="000000"/>
+                <w:kern w:val="0"/>
+                <w:sz w:val="22"/>
+                <w:szCs w:val="22"/>
+                <w:lang w:eastAsia="es-AR"/>
+                <w14:ligatures w14:val="none"/>
+              </w:rPr>
+              <w:t>,0</w:t>
+            </w:r>
+          </w:p>
+        </w:tc>
+      </w:tr>
+      <w:tr>
+        <w:trPr>
+          <w:trHeight w:val="300"/>
+          <w:jc w:val="center"/>
+        </w:trPr>
+        <w:tc>
+          <w:tcPr>
+            <w:tcW w:w="1718" w:type="dxa"/>
+            <w:tcBorders>
+              <w:top w:val="nil"/>
+              <w:bottom w:val="nil"/>
+              <w:right w:val="nil"/>
+            </w:tcBorders>
+            <w:shd w:val="clear" w:color="auto" w:fill="auto"/>
+            <w:noWrap/>
+            <w:vAlign w:val="bottom"/>
+            <w:hideMark/>
+          </w:tcPr>
+          <w:p>
+            <w:pPr>
+              <w:spacing w:after="0" w:line="240" w:lineRule="auto"/>
+              <w:rPr>
+                <w:rFonts w:ascii="Aptos Narrow" w:eastAsia="Times New Roman" w:hAnsi="Aptos Narrow" w:cs="Times New Roman"/>
+                <w:color w:val="000000"/>
+                <w:kern w:val="0"/>
+                <w:sz w:val="22"/>
+                <w:szCs w:val="22"/>
+                <w:lang w:eastAsia="es-AR"/>
+                <w14:ligatures w14:val="none"/>
+              </w:rPr>
+            </w:pPr>
+            <w:r>
+              <w:rPr>
+                <w:rFonts w:ascii="Aptos Narrow" w:eastAsia="Times New Roman" w:hAnsi="Aptos Narrow" w:cs="Times New Roman"/>
+                <w:color w:val="000000"/>
+                <w:kern w:val="0"/>
+                <w:sz w:val="22"/>
+                <w:szCs w:val="22"/>
+                <w:lang w:eastAsia="es-AR"/>
+                <w14:ligatures w14:val="none"/>
+              </w:rPr>
+              <w:t>Papa</w:t>
+            </w:r>
+          </w:p>
+        </w:tc>
+        <w:tc>
+          <w:tcPr>
+            <w:tcW w:w="2270" w:type="dxa"/>
+            <w:tcBorders>
+              <w:top w:val="nil"/>
+              <w:left w:val="nil"/>
+              <w:bottom w:val="nil"/>
+              <w:right w:val="nil"/>
+            </w:tcBorders>
+            <w:shd w:val="clear" w:color="auto" w:fill="auto"/>
+            <w:noWrap/>
+            <w:vAlign w:val="bottom"/>
+            <w:hideMark/>
+          </w:tcPr>
+          <w:p>
+            <w:pPr>
+              <w:spacing w:after="0" w:line="240" w:lineRule="auto"/>
+              <w:jc w:val="center"/>
+              <w:rPr>
+                <w:rFonts w:ascii="Aptos Narrow" w:eastAsia="Times New Roman" w:hAnsi="Aptos Narrow" w:cs="Times New Roman"/>
+                <w:color w:val="000000"/>
+                <w:kern w:val="0"/>
+                <w:sz w:val="22"/>
+                <w:szCs w:val="22"/>
+                <w:lang w:eastAsia="es-AR"/>
+                <w14:ligatures w14:val="none"/>
+              </w:rPr>
+            </w:pPr>
+            <w:r>
+              <w:rPr>
+                <w:rFonts w:ascii="Aptos Narrow" w:eastAsia="Times New Roman" w:hAnsi="Aptos Narrow" w:cs="Times New Roman"/>
+                <w:color w:val="000000"/>
+                <w:kern w:val="0"/>
+                <w:sz w:val="22"/>
+                <w:szCs w:val="22"/>
+                <w:lang w:eastAsia="es-AR"/>
+                <w14:ligatures w14:val="none"/>
+              </w:rPr>
+              <w:t>8</w:t>
+            </w:r>
+          </w:p>
+        </w:tc>
+        <w:tc>
+          <w:tcPr>
+            <w:tcW w:w="2497" w:type="dxa"/>
+            <w:tcBorders>
+              <w:top w:val="nil"/>
+              <w:left w:val="nil"/>
+              <w:bottom w:val="nil"/>
+            </w:tcBorders>
+            <w:shd w:val="clear" w:color="auto" w:fill="auto"/>
+            <w:noWrap/>
+            <w:vAlign w:val="bottom"/>
+            <w:hideMark/>
+          </w:tcPr>
+          <w:p>
+            <w:pPr>
+              <w:spacing w:after="0" w:line="240" w:lineRule="auto"/>
+              <w:jc w:val="center"/>
+              <w:rPr>
+                <w:rFonts w:ascii="Aptos Narrow" w:eastAsia="Times New Roman" w:hAnsi="Aptos Narrow" w:cs="Times New Roman"/>
+                <w:color w:val="000000"/>
+                <w:kern w:val="0"/>
+                <w:sz w:val="22"/>
+                <w:szCs w:val="22"/>
+                <w:lang w:eastAsia="es-AR"/>
+                <w14:ligatures w14:val="none"/>
+              </w:rPr>
+            </w:pPr>
+            <w:r>
+              <w:rPr>
+                <w:rFonts w:ascii="Aptos Narrow" w:eastAsia="Times New Roman" w:hAnsi="Aptos Narrow" w:cs="Times New Roman"/>
+                <w:color w:val="000000"/>
+                <w:kern w:val="0"/>
+                <w:sz w:val="22"/>
+                <w:szCs w:val="22"/>
+                <w:lang w:eastAsia="es-AR"/>
+                <w14:ligatures w14:val="none"/>
+              </w:rPr>
+              <w:t>5,0</w:t>
+            </w:r>
+          </w:p>
+        </w:tc>
+      </w:tr>
+      <w:tr>
+        <w:trPr>
+          <w:trHeight w:val="315"/>
+          <w:jc w:val="center"/>
+        </w:trPr>
+        <w:tc>
+          <w:tcPr>
+            <w:tcW w:w="1718" w:type="dxa"/>
+            <w:tcBorders>
+              <w:top w:val="nil"/>
+              <w:bottom w:val="nil"/>
+              <w:right w:val="nil"/>
+            </w:tcBorders>
+            <w:shd w:val="clear" w:color="auto" w:fill="auto"/>
+            <w:noWrap/>
+            <w:vAlign w:val="bottom"/>
+            <w:hideMark/>
+          </w:tcPr>
+          <w:p>
+            <w:pPr>
+              <w:spacing w:after="0" w:line="240" w:lineRule="auto"/>
+              <w:rPr>
+                <w:rFonts w:ascii="Aptos Narrow" w:eastAsia="Times New Roman" w:hAnsi="Aptos Narrow" w:cs="Times New Roman"/>
+                <w:color w:val="000000"/>
+                <w:kern w:val="0"/>
+                <w:sz w:val="22"/>
+                <w:szCs w:val="22"/>
+                <w:lang w:eastAsia="es-AR"/>
+                <w14:ligatures w14:val="none"/>
+              </w:rPr>
+            </w:pPr>
+            <w:r>
+              <w:rPr>
+                <w:rFonts w:ascii="Aptos Narrow" w:eastAsia="Times New Roman" w:hAnsi="Aptos Narrow" w:cs="Times New Roman"/>
+                <w:color w:val="000000"/>
+                <w:kern w:val="0"/>
+                <w:sz w:val="22"/>
+                <w:szCs w:val="22"/>
+                <w:lang w:eastAsia="es-AR"/>
+                <w14:ligatures w14:val="none"/>
+              </w:rPr>
+              <w:t>Soja</w:t>
+            </w:r>
+          </w:p>
+        </w:tc>
+        <w:tc>
+          <w:tcPr>
+            <w:tcW w:w="2270" w:type="dxa"/>
+            <w:tcBorders>
+              <w:top w:val="nil"/>
+              <w:left w:val="nil"/>
+              <w:bottom w:val="nil"/>
+              <w:right w:val="nil"/>
+            </w:tcBorders>
+            <w:shd w:val="clear" w:color="auto" w:fill="auto"/>
+            <w:noWrap/>
+            <w:vAlign w:val="bottom"/>
+            <w:hideMark/>
+          </w:tcPr>
+          <w:p>
+            <w:pPr>
+              <w:spacing w:after="0" w:line="240" w:lineRule="auto"/>
+              <w:jc w:val="center"/>
+              <w:rPr>
+                <w:rFonts w:ascii="Aptos Narrow" w:eastAsia="Times New Roman" w:hAnsi="Aptos Narrow" w:cs="Times New Roman"/>
+                <w:color w:val="000000"/>
+                <w:kern w:val="0"/>
+                <w:sz w:val="22"/>
+                <w:szCs w:val="22"/>
+                <w:lang w:eastAsia="es-AR"/>
+                <w14:ligatures w14:val="none"/>
+              </w:rPr>
+            </w:pPr>
+            <w:r>
+              <w:rPr>
+                <w:rFonts w:ascii="Aptos Narrow" w:eastAsia="Times New Roman" w:hAnsi="Aptos Narrow" w:cs="Times New Roman"/>
+                <w:color w:val="000000"/>
+                <w:kern w:val="0"/>
+                <w:sz w:val="22"/>
+                <w:szCs w:val="22"/>
+                <w:lang w:eastAsia="es-AR"/>
+                <w14:ligatures w14:val="none"/>
+              </w:rPr>
+              <w:t>8</w:t>
+            </w:r>
+          </w:p>
+        </w:tc>
+        <w:tc>
+          <w:tcPr>
+            <w:tcW w:w="2497" w:type="dxa"/>
+            <w:tcBorders>
+              <w:top w:val="nil"/>
+              <w:left w:val="nil"/>
+              <w:bottom w:val="nil"/>
+            </w:tcBorders>
+            <w:shd w:val="clear" w:color="auto" w:fill="auto"/>
+            <w:noWrap/>
+            <w:vAlign w:val="bottom"/>
+            <w:hideMark/>
+          </w:tcPr>
+          <w:p>
+            <w:pPr>
+              <w:spacing w:after="0" w:line="240" w:lineRule="auto"/>
+              <w:jc w:val="center"/>
+              <w:rPr>
+                <w:rFonts w:ascii="Aptos Narrow" w:eastAsia="Times New Roman" w:hAnsi="Aptos Narrow" w:cs="Times New Roman"/>
+                <w:color w:val="000000"/>
+                <w:kern w:val="0"/>
+                <w:sz w:val="22"/>
+                <w:szCs w:val="22"/>
+                <w:lang w:eastAsia="es-AR"/>
+                <w14:ligatures w14:val="none"/>
+              </w:rPr>
+            </w:pPr>
+            <w:r>
+              <w:rPr>
+                <w:rFonts w:ascii="Aptos Narrow" w:eastAsia="Times New Roman" w:hAnsi="Aptos Narrow" w:cs="Times New Roman"/>
+                <w:color w:val="000000"/>
+                <w:kern w:val="0"/>
+                <w:sz w:val="22"/>
+                <w:szCs w:val="22"/>
+                <w:lang w:eastAsia="es-AR"/>
+                <w14:ligatures w14:val="none"/>
+              </w:rPr>
+              <w:t>17,0</w:t>
+            </w:r>
+          </w:p>
+        </w:tc>
+      </w:tr>
+      <w:tr>
+        <w:trPr>
+          <w:trHeight w:val="300"/>
+          <w:jc w:val="center"/>
+        </w:trPr>
+        <w:tc>
+          <w:tcPr>
+            <w:tcW w:w="1718" w:type="dxa"/>
+            <w:tcBorders>
+              <w:top w:val="nil"/>
+              <w:bottom w:val="nil"/>
+              <w:right w:val="nil"/>
+            </w:tcBorders>
+            <w:shd w:val="clear" w:color="auto" w:fill="auto"/>
+            <w:noWrap/>
+            <w:vAlign w:val="bottom"/>
+            <w:hideMark/>
+          </w:tcPr>
+          <w:p>
+            <w:pPr>
+              <w:spacing w:after="0" w:line="240" w:lineRule="auto"/>
+              <w:rPr>
+                <w:rFonts w:ascii="Aptos Narrow" w:eastAsia="Times New Roman" w:hAnsi="Aptos Narrow" w:cs="Times New Roman"/>
+                <w:color w:val="000000"/>
+                <w:kern w:val="0"/>
+                <w:sz w:val="22"/>
+                <w:szCs w:val="22"/>
+                <w:lang w:eastAsia="es-AR"/>
+                <w14:ligatures w14:val="none"/>
+              </w:rPr>
+            </w:pPr>
+            <w:r>
+              <w:rPr>
+                <w:rFonts w:ascii="Aptos Narrow" w:eastAsia="Times New Roman" w:hAnsi="Aptos Narrow" w:cs="Times New Roman"/>
+                <w:color w:val="000000"/>
+                <w:kern w:val="0"/>
+                <w:sz w:val="22"/>
+                <w:szCs w:val="22"/>
+                <w:lang w:eastAsia="es-AR"/>
+                <w14:ligatures w14:val="none"/>
+              </w:rPr>
+              <w:t> </w:t>
+            </w:r>
+          </w:p>
+        </w:tc>
+        <w:tc>
+          <w:tcPr>
+            <w:tcW w:w="2270" w:type="dxa"/>
+            <w:tcBorders>
+              <w:top w:val="nil"/>
+              <w:left w:val="nil"/>
+              <w:bottom w:val="nil"/>
+              <w:right w:val="nil"/>
+            </w:tcBorders>
+            <w:shd w:val="clear" w:color="auto" w:fill="auto"/>
+            <w:noWrap/>
+            <w:vAlign w:val="bottom"/>
+            <w:hideMark/>
+          </w:tcPr>
+          <w:p>
+            <w:pPr>
+              <w:spacing w:after="0" w:line="240" w:lineRule="auto"/>
+              <w:rPr>
+                <w:rFonts w:ascii="Aptos Narrow" w:eastAsia="Times New Roman" w:hAnsi="Aptos Narrow" w:cs="Times New Roman"/>
+                <w:color w:val="000000"/>
+                <w:kern w:val="0"/>
+                <w:sz w:val="22"/>
+                <w:szCs w:val="22"/>
+                <w:lang w:eastAsia="es-AR"/>
+                <w14:ligatures w14:val="none"/>
+              </w:rPr>
+            </w:pPr>
+          </w:p>
+        </w:tc>
+        <w:tc>
+          <w:tcPr>
+            <w:tcW w:w="2497" w:type="dxa"/>
+            <w:tcBorders>
+              <w:top w:val="nil"/>
+              <w:left w:val="nil"/>
+              <w:bottom w:val="nil"/>
+            </w:tcBorders>
+            <w:shd w:val="clear" w:color="auto" w:fill="auto"/>
+            <w:noWrap/>
+            <w:vAlign w:val="bottom"/>
+            <w:hideMark/>
+          </w:tcPr>
+          <w:p>
+            <w:pPr>
+              <w:spacing w:after="0" w:line="240" w:lineRule="auto"/>
+              <w:rPr>
+                <w:rFonts w:ascii="Aptos Narrow" w:eastAsia="Times New Roman" w:hAnsi="Aptos Narrow" w:cs="Times New Roman"/>
+                <w:color w:val="000000"/>
+                <w:kern w:val="0"/>
+                <w:sz w:val="22"/>
+                <w:szCs w:val="22"/>
+                <w:lang w:eastAsia="es-AR"/>
+                <w14:ligatures w14:val="none"/>
+              </w:rPr>
+            </w:pPr>
+            <w:r>
+              <w:rPr>
+                <w:rFonts w:ascii="Aptos Narrow" w:eastAsia="Times New Roman" w:hAnsi="Aptos Narrow" w:cs="Times New Roman"/>
+                <w:color w:val="000000"/>
+                <w:kern w:val="0"/>
+                <w:sz w:val="22"/>
+                <w:szCs w:val="22"/>
+                <w:lang w:eastAsia="es-AR"/>
+                <w14:ligatures w14:val="none"/>
+              </w:rPr>
+              <w:t> </w:t>
+            </w:r>
+          </w:p>
+        </w:tc>
+      </w:tr>
+      <w:tr>
+        <w:trPr>
+          <w:trHeight w:val="300"/>
+          <w:jc w:val="center"/>
+        </w:trPr>
+        <w:tc>
+          <w:tcPr>
+            <w:tcW w:w="1718" w:type="dxa"/>
+            <w:tcBorders>
+              <w:top w:val="nil"/>
+              <w:bottom w:val="single" w:sz="4" w:space="0" w:color="auto"/>
+              <w:right w:val="nil"/>
+            </w:tcBorders>
+            <w:shd w:val="clear" w:color="auto" w:fill="auto"/>
+            <w:noWrap/>
+            <w:vAlign w:val="bottom"/>
+            <w:hideMark/>
+          </w:tcPr>
+          <w:p>
+            <w:pPr>
+              <w:spacing w:after="0" w:line="240" w:lineRule="auto"/>
+              <w:rPr>
+                <w:rFonts w:ascii="Aptos Narrow" w:eastAsia="Times New Roman" w:hAnsi="Aptos Narrow" w:cs="Times New Roman"/>
+                <w:color w:val="000000"/>
+                <w:kern w:val="0"/>
+                <w:sz w:val="22"/>
+                <w:szCs w:val="22"/>
+                <w:lang w:eastAsia="es-AR"/>
+                <w14:ligatures w14:val="none"/>
+              </w:rPr>
+            </w:pPr>
+            <w:r>
+              <w:rPr>
+                <w:rFonts w:ascii="Aptos Narrow" w:eastAsia="Times New Roman" w:hAnsi="Aptos Narrow" w:cs="Times New Roman"/>
+                <w:color w:val="000000"/>
+                <w:kern w:val="0"/>
+                <w:sz w:val="22"/>
+                <w:szCs w:val="22"/>
+                <w:lang w:eastAsia="es-AR"/>
+                <w14:ligatures w14:val="none"/>
+              </w:rPr>
+              <w:t> </w:t>
+            </w:r>
+          </w:p>
+        </w:tc>
+        <w:tc>
+          <w:tcPr>
+            <w:tcW w:w="4767" w:type="dxa"/>
+            <w:gridSpan w:val="2"/>
+            <w:tcBorders>
+              <w:top w:val="nil"/>
+              <w:left w:val="nil"/>
+              <w:bottom w:val="single" w:sz="4" w:space="0" w:color="auto"/>
+            </w:tcBorders>
+            <w:shd w:val="clear" w:color="auto" w:fill="auto"/>
+            <w:noWrap/>
+            <w:vAlign w:val="bottom"/>
+            <w:hideMark/>
+          </w:tcPr>
+          <w:p>
+            <w:pPr>
+              <w:spacing w:after="0" w:line="240" w:lineRule="auto"/>
+              <w:jc w:val="center"/>
+              <w:rPr>
+                <w:rFonts w:ascii="Aptos Narrow" w:eastAsia="Times New Roman" w:hAnsi="Aptos Narrow" w:cs="Times New Roman"/>
+                <w:b/>
+                <w:bCs/>
+                <w:color w:val="000000"/>
+                <w:kern w:val="0"/>
+                <w:sz w:val="22"/>
+                <w:szCs w:val="22"/>
+                <w:lang w:eastAsia="es-AR"/>
+                <w14:ligatures w14:val="none"/>
+              </w:rPr>
+            </w:pPr>
+            <w:r>
+              <w:rPr>
+                <w:rFonts w:ascii="Aptos Narrow" w:eastAsia="Times New Roman" w:hAnsi="Aptos Narrow" w:cs="Times New Roman"/>
+                <w:b/>
+                <w:bCs/>
+                <w:color w:val="000000"/>
+                <w:kern w:val="0"/>
+                <w:sz w:val="22"/>
+                <w:szCs w:val="22"/>
+                <w:lang w:eastAsia="es-AR"/>
+                <w14:ligatures w14:val="none"/>
+              </w:rPr>
+              <w:t xml:space="preserve">Nivel </w:t>
+            </w:r>
+            <w:r>
+              <w:rPr>
+                <w:rFonts w:ascii="Aptos Narrow" w:eastAsia="Times New Roman" w:hAnsi="Aptos Narrow" w:cs="Times New Roman"/>
+                <w:b/>
+                <w:bCs/>
+                <w:color w:val="000000"/>
+                <w:kern w:val="0"/>
+                <w:sz w:val="22"/>
+                <w:szCs w:val="22"/>
+                <w:lang w:eastAsia="es-AR"/>
+                <w14:ligatures w14:val="none"/>
+              </w:rPr>
+              <w:t xml:space="preserve">de </w:t>
+            </w:r>
+            <w:r>
+              <w:rPr>
+                <w:rFonts w:ascii="Aptos Narrow" w:eastAsia="Times New Roman" w:hAnsi="Aptos Narrow" w:cs="Times New Roman"/>
+                <w:b/>
+                <w:bCs/>
+                <w:color w:val="000000"/>
+                <w:kern w:val="0"/>
+                <w:sz w:val="22"/>
+                <w:szCs w:val="22"/>
+                <w:lang w:eastAsia="es-AR"/>
+                <w14:ligatures w14:val="none"/>
+              </w:rPr>
+              <w:t>K</w:t>
+            </w:r>
+            <w:r>
+              <w:rPr>
+                <w:rFonts w:ascii="Aptos Narrow" w:eastAsia="Times New Roman" w:hAnsi="Aptos Narrow" w:cs="Times New Roman"/>
+                <w:b/>
+                <w:bCs/>
+                <w:color w:val="000000"/>
+                <w:kern w:val="0"/>
+                <w:sz w:val="22"/>
+                <w:szCs w:val="22"/>
+                <w:lang w:eastAsia="es-AR"/>
+                <w14:ligatures w14:val="none"/>
+              </w:rPr>
+              <w:t xml:space="preserve"> </w:t>
+            </w:r>
+            <w:r>
+              <w:rPr>
+                <w:rFonts w:ascii="Aptos Narrow" w:eastAsia="Times New Roman" w:hAnsi="Aptos Narrow" w:cs="Times New Roman"/>
+                <w:b/>
+                <w:bCs/>
+                <w:color w:val="000000"/>
+                <w:kern w:val="0"/>
+                <w:sz w:val="22"/>
+                <w:szCs w:val="22"/>
+                <w:lang w:eastAsia="es-AR"/>
+                <w14:ligatures w14:val="none"/>
+              </w:rPr>
+              <w:t xml:space="preserve">objetivo </w:t>
+            </w:r>
+            <w:r>
+              <w:rPr>
+                <w:rFonts w:ascii="Aptos Narrow" w:eastAsia="Times New Roman" w:hAnsi="Aptos Narrow" w:cs="Times New Roman"/>
+                <w:b/>
+                <w:bCs/>
+                <w:color w:val="000000"/>
+                <w:kern w:val="0"/>
+                <w:sz w:val="22"/>
+                <w:szCs w:val="22"/>
+                <w:lang w:eastAsia="es-AR"/>
+                <w14:ligatures w14:val="none"/>
+              </w:rPr>
+              <w:t>(ppm)</w:t>
+            </w:r>
+          </w:p>
+        </w:tc>
+      </w:tr>
+      <w:tr>
+        <w:trPr>
+          <w:trHeight w:val="300"/>
+          <w:jc w:val="center"/>
+        </w:trPr>
+        <w:tc>
+          <w:tcPr>
+            <w:tcW w:w="1718" w:type="dxa"/>
+            <w:tcBorders>
+              <w:top w:val="nil"/>
+              <w:bottom w:val="nil"/>
+              <w:right w:val="nil"/>
+            </w:tcBorders>
+            <w:shd w:val="clear" w:color="auto" w:fill="auto"/>
+            <w:noWrap/>
+            <w:vAlign w:val="bottom"/>
+            <w:hideMark/>
+          </w:tcPr>
+          <w:p>
+            <w:pPr>
+              <w:spacing w:after="0" w:line="240" w:lineRule="auto"/>
+              <w:rPr>
+                <w:rFonts w:ascii="Aptos Narrow" w:eastAsia="Times New Roman" w:hAnsi="Aptos Narrow" w:cs="Times New Roman"/>
+                <w:color w:val="000000"/>
+                <w:kern w:val="0"/>
+                <w:sz w:val="22"/>
+                <w:szCs w:val="22"/>
+                <w:lang w:eastAsia="es-AR"/>
+                <w14:ligatures w14:val="none"/>
+              </w:rPr>
+            </w:pPr>
+            <w:r>
+              <w:rPr>
+                <w:rFonts w:ascii="Aptos Narrow" w:eastAsia="Times New Roman" w:hAnsi="Aptos Narrow" w:cs="Times New Roman"/>
+                <w:color w:val="000000"/>
+                <w:kern w:val="0"/>
+                <w:sz w:val="22"/>
+                <w:szCs w:val="22"/>
+                <w:lang w:eastAsia="es-AR"/>
+                <w14:ligatures w14:val="none"/>
+              </w:rPr>
+              <w:t>Ma</w:t>
+            </w:r>
+            <w:r>
+              <w:rPr>
+                <w:rFonts w:ascii="Aptos Narrow" w:eastAsia="Times New Roman" w:hAnsi="Aptos Narrow" w:cs="Times New Roman"/>
+                <w:color w:val="000000"/>
+                <w:kern w:val="0"/>
+                <w:sz w:val="22"/>
+                <w:szCs w:val="22"/>
+                <w:lang w:eastAsia="es-AR"/>
+                <w14:ligatures w14:val="none"/>
+              </w:rPr>
+              <w:t>í</w:t>
+            </w:r>
+            <w:r>
+              <w:rPr>
+                <w:rFonts w:ascii="Aptos Narrow" w:eastAsia="Times New Roman" w:hAnsi="Aptos Narrow" w:cs="Times New Roman"/>
+                <w:color w:val="000000"/>
+                <w:kern w:val="0"/>
+                <w:sz w:val="22"/>
+                <w:szCs w:val="22"/>
+                <w:lang w:eastAsia="es-AR"/>
+                <w14:ligatures w14:val="none"/>
+              </w:rPr>
+              <w:t>z</w:t>
+            </w:r>
+          </w:p>
+        </w:tc>
+        <w:tc>
+          <w:tcPr>
+            <w:tcW w:w="4767" w:type="dxa"/>
+            <w:gridSpan w:val="2"/>
+            <w:tcBorders>
+              <w:top w:val="nil"/>
+              <w:left w:val="nil"/>
+              <w:bottom w:val="nil"/>
+            </w:tcBorders>
+            <w:shd w:val="clear" w:color="auto" w:fill="auto"/>
+            <w:noWrap/>
+            <w:vAlign w:val="center"/>
+            <w:hideMark/>
+          </w:tcPr>
+          <w:p>
+            <w:pPr>
+              <w:spacing w:after="0" w:line="240" w:lineRule="auto"/>
+              <w:jc w:val="center"/>
+              <w:rPr>
+                <w:rFonts w:ascii="Aptos Narrow" w:eastAsia="Times New Roman" w:hAnsi="Aptos Narrow" w:cs="Times New Roman"/>
+                <w:color w:val="000000"/>
+                <w:kern w:val="0"/>
+                <w:sz w:val="22"/>
+                <w:szCs w:val="22"/>
+                <w:lang w:eastAsia="es-AR"/>
+                <w14:ligatures w14:val="none"/>
+              </w:rPr>
+            </w:pPr>
+            <w:r>
+              <w:rPr>
+                <w:rFonts w:ascii="Aptos Narrow" w:eastAsia="Times New Roman" w:hAnsi="Aptos Narrow" w:cs="Times New Roman"/>
+                <w:color w:val="000000"/>
+                <w:kern w:val="0"/>
+                <w:sz w:val="22"/>
+                <w:szCs w:val="22"/>
+                <w:lang w:eastAsia="es-AR"/>
+                <w14:ligatures w14:val="none"/>
+              </w:rPr>
+              <w:t>2</w:t>
+            </w:r>
+            <w:r>
+              <w:rPr>
+                <w:rFonts w:ascii="Aptos Narrow" w:eastAsia="Times New Roman" w:hAnsi="Aptos Narrow" w:cs="Times New Roman"/>
+                <w:color w:val="000000"/>
+                <w:kern w:val="0"/>
+                <w:sz w:val="22"/>
+                <w:szCs w:val="22"/>
+                <w:lang w:eastAsia="es-AR"/>
+                <w14:ligatures w14:val="none"/>
+              </w:rPr>
+              <w:t>6</w:t>
+            </w:r>
+            <w:r>
+              <w:rPr>
+                <w:rFonts w:ascii="Aptos Narrow" w:eastAsia="Times New Roman" w:hAnsi="Aptos Narrow" w:cs="Times New Roman"/>
+                <w:color w:val="000000"/>
+                <w:kern w:val="0"/>
+                <w:sz w:val="22"/>
+                <w:szCs w:val="22"/>
+                <w:lang w:eastAsia="es-AR"/>
+                <w14:ligatures w14:val="none"/>
+              </w:rPr>
+              <w:t>0</w:t>
+            </w:r>
+          </w:p>
+        </w:tc>
+      </w:tr>
+      <w:tr>
+        <w:trPr>
+          <w:trHeight w:val="300"/>
+          <w:jc w:val="center"/>
+        </w:trPr>
+        <w:tc>
+          <w:tcPr>
+            <w:tcW w:w="1718" w:type="dxa"/>
+            <w:tcBorders>
+              <w:top w:val="nil"/>
+              <w:bottom w:val="nil"/>
+              <w:right w:val="nil"/>
+            </w:tcBorders>
+            <w:shd w:val="clear" w:color="auto" w:fill="auto"/>
+            <w:noWrap/>
+            <w:vAlign w:val="bottom"/>
+            <w:hideMark/>
+          </w:tcPr>
+          <w:p>
+            <w:pPr>
+              <w:spacing w:after="0" w:line="240" w:lineRule="auto"/>
+              <w:rPr>
+                <w:rFonts w:ascii="Aptos Narrow" w:eastAsia="Times New Roman" w:hAnsi="Aptos Narrow" w:cs="Times New Roman"/>
+                <w:color w:val="000000"/>
+                <w:kern w:val="0"/>
+                <w:sz w:val="22"/>
+                <w:szCs w:val="22"/>
+                <w:lang w:eastAsia="es-AR"/>
+                <w14:ligatures w14:val="none"/>
+              </w:rPr>
+            </w:pPr>
+            <w:r>
+              <w:rPr>
+                <w:rFonts w:ascii="Aptos Narrow" w:eastAsia="Times New Roman" w:hAnsi="Aptos Narrow" w:cs="Times New Roman"/>
+                <w:color w:val="000000"/>
+                <w:kern w:val="0"/>
+                <w:sz w:val="22"/>
+                <w:szCs w:val="22"/>
+                <w:lang w:eastAsia="es-AR"/>
+                <w14:ligatures w14:val="none"/>
+              </w:rPr>
+              <w:t>Trigo / Cebada</w:t>
+            </w:r>
+          </w:p>
+        </w:tc>
+        <w:tc>
+          <w:tcPr>
+            <w:tcW w:w="4767" w:type="dxa"/>
+            <w:gridSpan w:val="2"/>
+            <w:tcBorders>
+              <w:top w:val="nil"/>
+              <w:left w:val="nil"/>
+              <w:bottom w:val="nil"/>
+            </w:tcBorders>
+            <w:shd w:val="clear" w:color="auto" w:fill="auto"/>
+            <w:noWrap/>
+            <w:vAlign w:val="center"/>
+            <w:hideMark/>
+          </w:tcPr>
+          <w:p>
+            <w:pPr>
+              <w:spacing w:after="0" w:line="240" w:lineRule="auto"/>
+              <w:jc w:val="center"/>
+              <w:rPr>
+                <w:rFonts w:ascii="Aptos Narrow" w:eastAsia="Times New Roman" w:hAnsi="Aptos Narrow" w:cs="Times New Roman"/>
+                <w:color w:val="000000"/>
+                <w:kern w:val="0"/>
+                <w:sz w:val="22"/>
+                <w:szCs w:val="22"/>
+                <w:lang w:eastAsia="es-AR"/>
+                <w14:ligatures w14:val="none"/>
+              </w:rPr>
+            </w:pPr>
+            <w:r>
+              <w:rPr>
+                <w:rFonts w:ascii="Aptos Narrow" w:eastAsia="Times New Roman" w:hAnsi="Aptos Narrow" w:cs="Times New Roman"/>
+                <w:color w:val="000000"/>
+                <w:kern w:val="0"/>
+                <w:sz w:val="22"/>
+                <w:szCs w:val="22"/>
+                <w:lang w:eastAsia="es-AR"/>
+                <w14:ligatures w14:val="none"/>
+              </w:rPr>
+              <w:t>2</w:t>
+            </w:r>
+            <w:r>
+              <w:rPr>
+                <w:rFonts w:ascii="Aptos Narrow" w:eastAsia="Times New Roman" w:hAnsi="Aptos Narrow" w:cs="Times New Roman"/>
+                <w:color w:val="000000"/>
+                <w:kern w:val="0"/>
+                <w:sz w:val="22"/>
+                <w:szCs w:val="22"/>
+                <w:lang w:eastAsia="es-AR"/>
+                <w14:ligatures w14:val="none"/>
+              </w:rPr>
+              <w:t>6</w:t>
+            </w:r>
+            <w:r>
+              <w:rPr>
+                <w:rFonts w:ascii="Aptos Narrow" w:eastAsia="Times New Roman" w:hAnsi="Aptos Narrow" w:cs="Times New Roman"/>
+                <w:color w:val="000000"/>
+                <w:kern w:val="0"/>
+                <w:sz w:val="22"/>
+                <w:szCs w:val="22"/>
+                <w:lang w:eastAsia="es-AR"/>
+                <w14:ligatures w14:val="none"/>
+              </w:rPr>
+              <w:t>0</w:t>
+            </w:r>
+          </w:p>
+        </w:tc>
+      </w:tr>
+      <w:tr>
+        <w:trPr>
+          <w:trHeight w:val="300"/>
+          <w:jc w:val="center"/>
+        </w:trPr>
+        <w:tc>
+          <w:tcPr>
+            <w:tcW w:w="1718" w:type="dxa"/>
+            <w:tcBorders>
+              <w:top w:val="nil"/>
+              <w:bottom w:val="nil"/>
+              <w:right w:val="nil"/>
+            </w:tcBorders>
+            <w:shd w:val="clear" w:color="auto" w:fill="auto"/>
+            <w:noWrap/>
+            <w:vAlign w:val="bottom"/>
+            <w:hideMark/>
+          </w:tcPr>
+          <w:p>
+            <w:pPr>
+              <w:spacing w:after="0" w:line="240" w:lineRule="auto"/>
+              <w:rPr>
+                <w:rFonts w:ascii="Aptos Narrow" w:eastAsia="Times New Roman" w:hAnsi="Aptos Narrow" w:cs="Times New Roman"/>
+                <w:color w:val="000000"/>
+                <w:kern w:val="0"/>
+                <w:sz w:val="22"/>
+                <w:szCs w:val="22"/>
+                <w:lang w:eastAsia="es-AR"/>
+                <w14:ligatures w14:val="none"/>
+              </w:rPr>
+            </w:pPr>
+            <w:r>
+              <w:rPr>
+                <w:rFonts w:ascii="Aptos Narrow" w:eastAsia="Times New Roman" w:hAnsi="Aptos Narrow" w:cs="Times New Roman"/>
+                <w:color w:val="000000"/>
+                <w:kern w:val="0"/>
+                <w:sz w:val="22"/>
+                <w:szCs w:val="22"/>
+                <w:lang w:eastAsia="es-AR"/>
+                <w14:ligatures w14:val="none"/>
+              </w:rPr>
+              <w:t>Girasol</w:t>
+            </w:r>
+          </w:p>
+        </w:tc>
+        <w:tc>
+          <w:tcPr>
+            <w:tcW w:w="4767" w:type="dxa"/>
+            <w:gridSpan w:val="2"/>
+            <w:tcBorders>
+              <w:top w:val="nil"/>
+              <w:left w:val="nil"/>
+              <w:bottom w:val="nil"/>
+            </w:tcBorders>
+            <w:shd w:val="clear" w:color="auto" w:fill="auto"/>
+            <w:noWrap/>
+            <w:vAlign w:val="center"/>
+            <w:hideMark/>
+          </w:tcPr>
+          <w:p>
+            <w:pPr>
+              <w:spacing w:after="0" w:line="240" w:lineRule="auto"/>
+              <w:jc w:val="center"/>
+              <w:rPr>
+                <w:rFonts w:ascii="Aptos Narrow" w:eastAsia="Times New Roman" w:hAnsi="Aptos Narrow" w:cs="Times New Roman"/>
+                <w:color w:val="000000"/>
+                <w:kern w:val="0"/>
+                <w:sz w:val="22"/>
+                <w:szCs w:val="22"/>
+                <w:lang w:eastAsia="es-AR"/>
+                <w14:ligatures w14:val="none"/>
+              </w:rPr>
+            </w:pPr>
+            <w:r>
+              <w:rPr>
+                <w:rFonts w:ascii="Aptos Narrow" w:eastAsia="Times New Roman" w:hAnsi="Aptos Narrow" w:cs="Times New Roman"/>
+                <w:color w:val="000000"/>
+                <w:kern w:val="0"/>
+                <w:sz w:val="22"/>
+                <w:szCs w:val="22"/>
+                <w:lang w:eastAsia="es-AR"/>
+                <w14:ligatures w14:val="none"/>
+              </w:rPr>
+              <w:t>2</w:t>
+            </w:r>
+            <w:r>
+              <w:rPr>
+                <w:rFonts w:ascii="Aptos Narrow" w:eastAsia="Times New Roman" w:hAnsi="Aptos Narrow" w:cs="Times New Roman"/>
+                <w:color w:val="000000"/>
+                <w:kern w:val="0"/>
+                <w:sz w:val="22"/>
+                <w:szCs w:val="22"/>
+                <w:lang w:eastAsia="es-AR"/>
+                <w14:ligatures w14:val="none"/>
+              </w:rPr>
+              <w:t>6</w:t>
+            </w:r>
+            <w:r>
+              <w:rPr>
+                <w:rFonts w:ascii="Aptos Narrow" w:eastAsia="Times New Roman" w:hAnsi="Aptos Narrow" w:cs="Times New Roman"/>
+                <w:color w:val="000000"/>
+                <w:kern w:val="0"/>
+                <w:sz w:val="22"/>
+                <w:szCs w:val="22"/>
+                <w:lang w:eastAsia="es-AR"/>
+                <w14:ligatures w14:val="none"/>
+              </w:rPr>
+              <w:t>0</w:t>
+            </w:r>
+          </w:p>
+        </w:tc>
+      </w:tr>
+      <w:tr>
+        <w:trPr>
+          <w:trHeight w:val="300"/>
+          <w:jc w:val="center"/>
+        </w:trPr>
+        <w:tc>
+          <w:tcPr>
+            <w:tcW w:w="1718" w:type="dxa"/>
+            <w:tcBorders>
+              <w:top w:val="nil"/>
+              <w:bottom w:val="nil"/>
+              <w:right w:val="nil"/>
+            </w:tcBorders>
+            <w:shd w:val="clear" w:color="auto" w:fill="auto"/>
+            <w:noWrap/>
+            <w:vAlign w:val="bottom"/>
+            <w:hideMark/>
+          </w:tcPr>
+          <w:p>
+            <w:pPr>
+              <w:spacing w:after="0" w:line="240" w:lineRule="auto"/>
+              <w:rPr>
+                <w:rFonts w:ascii="Aptos Narrow" w:eastAsia="Times New Roman" w:hAnsi="Aptos Narrow" w:cs="Times New Roman"/>
+                <w:color w:val="000000"/>
+                <w:kern w:val="0"/>
+                <w:sz w:val="22"/>
+                <w:szCs w:val="22"/>
+                <w:lang w:eastAsia="es-AR"/>
+                <w14:ligatures w14:val="none"/>
+              </w:rPr>
+            </w:pPr>
+            <w:r>
+              <w:rPr>
+                <w:rFonts w:ascii="Aptos Narrow" w:eastAsia="Times New Roman" w:hAnsi="Aptos Narrow" w:cs="Times New Roman"/>
+                <w:color w:val="000000"/>
+                <w:kern w:val="0"/>
+                <w:sz w:val="22"/>
+                <w:szCs w:val="22"/>
+                <w:lang w:eastAsia="es-AR"/>
+                <w14:ligatures w14:val="none"/>
+              </w:rPr>
+              <w:t>Papa</w:t>
+            </w:r>
+          </w:p>
+        </w:tc>
+        <w:tc>
+          <w:tcPr>
+            <w:tcW w:w="4767" w:type="dxa"/>
+            <w:gridSpan w:val="2"/>
+            <w:tcBorders>
+              <w:top w:val="nil"/>
+              <w:left w:val="nil"/>
+              <w:bottom w:val="nil"/>
+            </w:tcBorders>
+            <w:shd w:val="clear" w:color="auto" w:fill="auto"/>
+            <w:noWrap/>
+            <w:vAlign w:val="center"/>
+            <w:hideMark/>
+          </w:tcPr>
+          <w:p>
+            <w:pPr>
+              <w:spacing w:after="0" w:line="240" w:lineRule="auto"/>
+              <w:jc w:val="center"/>
+              <w:rPr>
+                <w:rFonts w:ascii="Aptos Narrow" w:eastAsia="Times New Roman" w:hAnsi="Aptos Narrow" w:cs="Times New Roman"/>
+                <w:color w:val="000000"/>
+                <w:kern w:val="0"/>
+                <w:sz w:val="22"/>
+                <w:szCs w:val="22"/>
+                <w:lang w:eastAsia="es-AR"/>
+                <w14:ligatures w14:val="none"/>
+              </w:rPr>
+            </w:pPr>
+            <w:r>
+              <w:rPr>
+                <w:rFonts w:ascii="Aptos Narrow" w:eastAsia="Times New Roman" w:hAnsi="Aptos Narrow" w:cs="Times New Roman"/>
+                <w:color w:val="000000"/>
+                <w:kern w:val="0"/>
+                <w:sz w:val="22"/>
+                <w:szCs w:val="22"/>
+                <w:lang w:eastAsia="es-AR"/>
+                <w14:ligatures w14:val="none"/>
+              </w:rPr>
+              <w:t>26</w:t>
+            </w:r>
+            <w:r>
+              <w:rPr>
+                <w:rFonts w:ascii="Aptos Narrow" w:eastAsia="Times New Roman" w:hAnsi="Aptos Narrow" w:cs="Times New Roman"/>
+                <w:color w:val="000000"/>
+                <w:kern w:val="0"/>
+                <w:sz w:val="22"/>
+                <w:szCs w:val="22"/>
+                <w:lang w:eastAsia="es-AR"/>
+                <w14:ligatures w14:val="none"/>
+              </w:rPr>
+              <w:t>0</w:t>
+            </w:r>
+          </w:p>
+        </w:tc>
+      </w:tr>
+      <w:tr>
+        <w:trPr>
+          <w:trHeight w:val="315"/>
+          <w:jc w:val="center"/>
+        </w:trPr>
+        <w:tc>
+          <w:tcPr>
+            <w:tcW w:w="1718" w:type="dxa"/>
+            <w:tcBorders>
+              <w:top w:val="nil"/>
+              <w:bottom w:val="single" w:sz="12" w:space="0" w:color="auto"/>
+              <w:right w:val="nil"/>
+            </w:tcBorders>
+            <w:shd w:val="clear" w:color="auto" w:fill="auto"/>
+            <w:noWrap/>
+            <w:vAlign w:val="bottom"/>
+            <w:hideMark/>
+          </w:tcPr>
+          <w:p>
+            <w:pPr>
+              <w:spacing w:after="0" w:line="240" w:lineRule="auto"/>
+              <w:rPr>
+                <w:rFonts w:ascii="Aptos Narrow" w:eastAsia="Times New Roman" w:hAnsi="Aptos Narrow" w:cs="Times New Roman"/>
+                <w:color w:val="000000"/>
+                <w:kern w:val="0"/>
+                <w:sz w:val="22"/>
+                <w:szCs w:val="22"/>
+                <w:lang w:eastAsia="es-AR"/>
+                <w14:ligatures w14:val="none"/>
+              </w:rPr>
+            </w:pPr>
+            <w:r>
+              <w:rPr>
+                <w:rFonts w:ascii="Aptos Narrow" w:eastAsia="Times New Roman" w:hAnsi="Aptos Narrow" w:cs="Times New Roman"/>
+                <w:color w:val="000000"/>
+                <w:kern w:val="0"/>
+                <w:sz w:val="22"/>
+                <w:szCs w:val="22"/>
+                <w:lang w:eastAsia="es-AR"/>
+                <w14:ligatures w14:val="none"/>
+              </w:rPr>
+              <w:t>Soja</w:t>
+            </w:r>
+          </w:p>
+        </w:tc>
+        <w:tc>
+          <w:tcPr>
+            <w:tcW w:w="4767" w:type="dxa"/>
+            <w:gridSpan w:val="2"/>
+            <w:tcBorders>
+              <w:top w:val="nil"/>
+              <w:left w:val="nil"/>
+              <w:bottom w:val="single" w:sz="12" w:space="0" w:color="auto"/>
+            </w:tcBorders>
+            <w:shd w:val="clear" w:color="auto" w:fill="auto"/>
+            <w:noWrap/>
+            <w:vAlign w:val="center"/>
+            <w:hideMark/>
+          </w:tcPr>
+          <w:p>
+            <w:pPr>
+              <w:spacing w:after="0" w:line="240" w:lineRule="auto"/>
+              <w:jc w:val="center"/>
+              <w:rPr>
+                <w:rFonts w:ascii="Aptos Narrow" w:eastAsia="Times New Roman" w:hAnsi="Aptos Narrow" w:cs="Times New Roman"/>
+                <w:color w:val="000000"/>
+                <w:kern w:val="0"/>
+                <w:sz w:val="22"/>
+                <w:szCs w:val="22"/>
+                <w:lang w:eastAsia="es-AR"/>
+                <w14:ligatures w14:val="none"/>
+              </w:rPr>
+            </w:pPr>
+            <w:r>
+              <w:rPr>
+                <w:rFonts w:ascii="Aptos Narrow" w:eastAsia="Times New Roman" w:hAnsi="Aptos Narrow" w:cs="Times New Roman"/>
+                <w:color w:val="000000"/>
+                <w:kern w:val="0"/>
+                <w:sz w:val="22"/>
+                <w:szCs w:val="22"/>
+                <w:lang w:eastAsia="es-AR"/>
+                <w14:ligatures w14:val="none"/>
+              </w:rPr>
+              <w:t>2</w:t>
+            </w:r>
+            <w:r>
+              <w:rPr>
+                <w:rFonts w:ascii="Aptos Narrow" w:eastAsia="Times New Roman" w:hAnsi="Aptos Narrow" w:cs="Times New Roman"/>
+                <w:color w:val="000000"/>
+                <w:kern w:val="0"/>
+                <w:sz w:val="22"/>
+                <w:szCs w:val="22"/>
+                <w:lang w:eastAsia="es-AR"/>
+                <w14:ligatures w14:val="none"/>
+              </w:rPr>
+              <w:t>6</w:t>
+            </w:r>
+            <w:r>
+              <w:rPr>
+                <w:rFonts w:ascii="Aptos Narrow" w:eastAsia="Times New Roman" w:hAnsi="Aptos Narrow" w:cs="Times New Roman"/>
+                <w:color w:val="000000"/>
+                <w:kern w:val="0"/>
+                <w:sz w:val="22"/>
+                <w:szCs w:val="22"/>
+                <w:lang w:eastAsia="es-AR"/>
+                <w14:ligatures w14:val="none"/>
+              </w:rPr>
+              <w:t>0</w:t>
+            </w:r>
+          </w:p>
+        </w:tc>
+      </w:tr>
+    </w:tbl>
+    <w:p>
+      <w:pPr>
+        <w:rPr>
+          <w:rFonts w:ascii="Calibri" w:hAnsi="Calibri" w:cs="Calibri"/>
+          <w:sz w:val="28"/>
+          <w:szCs w:val="28"/>
+        </w:rPr>
+      </w:pPr>
+    </w:p>
+    <w:p>
+      <w:pPr>
+        <w:numPr>
+          <w:ilvl w:val="0"/>
+          <w:numId w:val="5"/>
+        </w:numPr>
+        <w:rPr>
+          <w:rFonts w:ascii="Calibri" w:hAnsi="Calibri" w:cs="Calibri"/>
+          <w:sz w:val="28"/>
+          <w:szCs w:val="28"/>
+        </w:rPr>
+      </w:pPr>
+      <w:r>
+        <w:rPr>
+          <w:rFonts w:ascii="Calibri" w:hAnsi="Calibri" w:cs="Calibri"/>
+          <w:b/>
+          <w:bCs/>
+          <w:sz w:val="28"/>
+          <w:szCs w:val="28"/>
+        </w:rPr>
+        <w:t>Múltiples lotes</w:t>
+      </w:r>
+      <w:r>
+        <w:rPr>
+          <w:rFonts w:ascii="Calibri" w:hAnsi="Calibri" w:cs="Calibri"/>
+          <w:sz w:val="28"/>
+          <w:szCs w:val="28"/>
+        </w:rPr>
+        <w:t>:</w:t>
+      </w:r>
+    </w:p>
+    <w:p>
+      <w:pPr>
+        <w:numPr>
+          <w:ilvl w:val="1"/>
+          <w:numId w:val="5"/>
+        </w:numPr>
+        <w:rPr>
+          <w:rFonts w:ascii="Calibri" w:hAnsi="Calibri" w:cs="Calibri"/>
+          <w:sz w:val="28"/>
+          <w:szCs w:val="28"/>
+        </w:rPr>
+      </w:pPr>
+      <w:r>
+        <w:rPr>
+          <w:rFonts w:ascii="Calibri" w:hAnsi="Calibri" w:cs="Calibri"/>
+          <w:sz w:val="28"/>
+          <w:szCs w:val="28"/>
+        </w:rPr>
+        <w:t xml:space="preserve">Genera una tabla </w:t>
+      </w:r>
+      <w:r>
+        <w:rPr>
+          <w:rFonts w:ascii="Calibri" w:hAnsi="Calibri" w:cs="Calibri"/>
+          <w:sz w:val="28"/>
+          <w:szCs w:val="28"/>
+        </w:rPr>
+        <w:t xml:space="preserve">con datos de dosis de suficiencia (kg </w:t>
+      </w:r>
+      <w:r>
+        <w:rPr>
+          <w:rFonts w:ascii="Calibri" w:hAnsi="Calibri" w:cs="Calibri"/>
+          <w:sz w:val="28"/>
+          <w:szCs w:val="28"/>
+        </w:rPr>
+        <w:t>K</w:t>
+      </w:r>
+      <w:r>
+        <w:rPr>
+          <w:rFonts w:ascii="Calibri" w:hAnsi="Calibri" w:cs="Calibri"/>
+          <w:sz w:val="28"/>
+          <w:szCs w:val="28"/>
+        </w:rPr>
+        <w:t xml:space="preserve">/ha), </w:t>
+      </w:r>
+      <w:r>
+        <w:rPr>
+          <w:rFonts w:ascii="Calibri" w:hAnsi="Calibri" w:cs="Calibri"/>
+          <w:sz w:val="28"/>
+          <w:szCs w:val="28"/>
+        </w:rPr>
+        <w:t>dosis</w:t>
+      </w:r>
+      <w:r>
+        <w:rPr>
+          <w:rFonts w:ascii="Calibri" w:hAnsi="Calibri" w:cs="Calibri"/>
+          <w:sz w:val="28"/>
+          <w:szCs w:val="28"/>
+        </w:rPr>
+        <w:t xml:space="preserve"> de construcción (kg </w:t>
+      </w:r>
+      <w:r>
+        <w:rPr>
+          <w:rFonts w:ascii="Calibri" w:hAnsi="Calibri" w:cs="Calibri"/>
+          <w:sz w:val="28"/>
+          <w:szCs w:val="28"/>
+        </w:rPr>
+        <w:t>K</w:t>
+      </w:r>
+      <w:r>
+        <w:rPr>
+          <w:rFonts w:ascii="Calibri" w:hAnsi="Calibri" w:cs="Calibri"/>
+          <w:sz w:val="28"/>
+          <w:szCs w:val="28"/>
+        </w:rPr>
+        <w:t xml:space="preserve">/ha), dosis de mantenimiento (kg </w:t>
+      </w:r>
+      <w:r>
+        <w:rPr>
+          <w:rFonts w:ascii="Calibri" w:hAnsi="Calibri" w:cs="Calibri"/>
+          <w:sz w:val="28"/>
+          <w:szCs w:val="28"/>
+        </w:rPr>
+        <w:t>K</w:t>
+      </w:r>
+      <w:r>
+        <w:rPr>
+          <w:rFonts w:ascii="Calibri" w:hAnsi="Calibri" w:cs="Calibri"/>
+          <w:sz w:val="28"/>
+          <w:szCs w:val="28"/>
+        </w:rPr>
+        <w:t xml:space="preserve">/ha) y dosis de construcción más mantenimiento (kg </w:t>
+      </w:r>
+      <w:r>
+        <w:rPr>
+          <w:rFonts w:ascii="Calibri" w:hAnsi="Calibri" w:cs="Calibri"/>
+          <w:sz w:val="28"/>
+          <w:szCs w:val="28"/>
+        </w:rPr>
+        <w:t>K</w:t>
+      </w:r>
+      <w:r>
+        <w:rPr>
+          <w:rFonts w:ascii="Calibri" w:hAnsi="Calibri" w:cs="Calibri"/>
+          <w:sz w:val="28"/>
+          <w:szCs w:val="28"/>
+        </w:rPr>
+        <w:t xml:space="preserve">/ha). La tabla es </w:t>
+      </w:r>
+      <w:r>
+        <w:rPr>
+          <w:rFonts w:ascii="Calibri" w:hAnsi="Calibri" w:cs="Calibri"/>
+          <w:sz w:val="28"/>
+          <w:szCs w:val="28"/>
+        </w:rPr>
+        <w:t>descargable en formato .xlsx.</w:t>
+      </w:r>
+    </w:p>
+    <w:p>
+      <w:pPr>
+        <w:rPr>
+          <w:rFonts w:ascii="Calibri" w:hAnsi="Calibri" w:cs="Calibri"/>
+          <w:sz w:val="28"/>
+          <w:szCs w:val="28"/>
+        </w:rPr>
+      </w:pPr>
+      <w:r>
+        <w:rPr>
+          <w:rFonts w:ascii="Calibri" w:hAnsi="Calibri" w:cs="Calibri"/>
+          <w:sz w:val="28"/>
+          <w:szCs w:val="28"/>
+        </w:rPr>
+        <w:pict w14:anchorId="56BCDDD7">
+          <v:rect id="_x0000_i1032" style="width:0;height:1.5pt" o:hralign="center" o:hrstd="t" o:hr="t" fillcolor="#a0a0a0" stroked="f"/>
+        </w:pict>
+      </w:r>
+    </w:p>
+    <w:p>
+      <w:pPr>
+        <w:rPr>
+          <w:rFonts w:ascii="Calibri" w:hAnsi="Calibri" w:cs="Calibri"/>
+          <w:sz w:val="28"/>
+          <w:szCs w:val="28"/>
+        </w:rPr>
+      </w:pPr>
+    </w:p>
+    <w:p>
+      <w:pPr>
+        <w:rPr>
+          <w:rFonts w:ascii="Calibri" w:hAnsi="Calibri" w:cs="Calibri"/>
           <w:b/>
           <w:bCs/>
           <w:sz w:val="28"/>
@@ -15026,7 +18179,25 @@
           <w:bCs/>
           <w:lang w:val="en-US"/>
         </w:rPr>
-        <w:t>. 2015. Using canopy indices to quantify the economic optimum nitrogen rate in spring wheat. Agronomy Journal 107: 459-465.</w:t>
+        <w:t xml:space="preserve">. 2015. Using canopy indices to quantify the </w:t>
+      </w:r>
+      <w:proofErr w:type="gramStart"/>
+      <w:r>
+        <w:rPr>
+          <w:rFonts w:ascii="Calibri" w:hAnsi="Calibri" w:cs="Calibri"/>
+          <w:bCs/>
+          <w:lang w:val="en-US"/>
+        </w:rPr>
+        <w:t>economic optimum nitrogen</w:t>
+      </w:r>
+      <w:proofErr w:type="gramEnd"/>
+      <w:r>
+        <w:rPr>
+          <w:rFonts w:ascii="Calibri" w:hAnsi="Calibri" w:cs="Calibri"/>
+          <w:bCs/>
+          <w:lang w:val="en-US"/>
+        </w:rPr>
+        <w:t xml:space="preserve"> rate in spring wheat. Agronomy Journal 107: 459-465.</w:t>
       </w:r>
     </w:p>
     <w:p>
@@ -15542,6 +18713,7 @@
         <w:docPartUnique/>
       </w:docPartObj>
     </w:sdtPr>
+    <w:sdtEndPr/>
     <w:sdtContent>
       <w:p>
         <w:pPr>

</xml_diff>